<commit_message>
Fixed visual glitch in evidence
</commit_message>
<xml_diff>
--- a/COS 214 Practical 3 PDF Pre-Final.docx
+++ b/COS 214 Practical 3 PDF Pre-Final.docx
@@ -1094,6 +1094,7 @@
       </w:pPr>
       <w:r>
         <w:rPr>
+          <w:noProof/>
           <w:lang w:val="en-US"/>
         </w:rPr>
         <w:drawing>
@@ -1731,6 +1732,9 @@
     </w:p>
     <w:p>
       <w:r>
+        <w:rPr>
+          <w:noProof/>
+        </w:rPr>
         <w:drawing>
           <wp:inline distT="0" distB="0" distL="0" distR="0" wp14:anchorId="42D7D706" wp14:editId="1B515DC3">
             <wp:extent cx="5731510" cy="300355"/>
@@ -5034,17 +5038,16 @@
         <w:t xml:space="preserve"> </w:t>
       </w:r>
     </w:p>
-    <w:p/>
-    <w:p/>
-    <w:p>
-      <w:r>
-        <w:rPr>
+    <w:p>
+      <w:r>
+        <w:rPr>
+          <w:noProof/>
           <w:sz w:val="2"/>
           <w:szCs w:val="2"/>
           <w:lang w:val="en-US"/>
         </w:rPr>
         <w:drawing>
-          <wp:inline distT="0" distB="0" distL="0" distR="0" wp14:anchorId="0E6670E0" wp14:editId="2FEC55C0">
+          <wp:inline distT="0" distB="0" distL="0" distR="0" wp14:anchorId="0E6670E0" wp14:editId="31F68B66">
             <wp:extent cx="5731510" cy="615950"/>
             <wp:effectExtent l="0" t="0" r="2540" b="0"/>
             <wp:docPr id="691972360" name="Picture 1"/>
@@ -5081,6 +5084,7 @@
       </w:r>
       <w:r>
         <w:rPr>
+          <w:noProof/>
           <w:sz w:val="2"/>
           <w:szCs w:val="2"/>
           <w:lang w:val="en-US"/>
@@ -5123,6 +5127,7 @@
       </w:r>
       <w:r>
         <w:rPr>
+          <w:noProof/>
           <w:sz w:val="2"/>
           <w:szCs w:val="2"/>
           <w:lang w:val="en-US"/>
@@ -5164,6 +5169,31 @@
         </w:drawing>
       </w:r>
     </w:p>
+    <w:p/>
+    <w:p/>
+    <w:p/>
+    <w:p>
+      <w:r>
+        <w:lastRenderedPageBreak/>
+        <w:t>Takunda</w:t>
+      </w:r>
+    </w:p>
+    <w:p/>
+    <w:p/>
+    <w:p/>
+    <w:p/>
+    <w:p/>
+    <w:p/>
+    <w:p/>
+    <w:p/>
+    <w:p/>
+    <w:p/>
+    <w:p/>
+    <w:p>
+      <w:r>
+        <w:t>Brett</w:t>
+      </w:r>
+    </w:p>
     <w:p>
       <w:pPr>
         <w:rPr>
@@ -5173,6 +5203,73 @@
         </w:rPr>
       </w:pPr>
       <w:r>
+        <w:rPr>
+          <w:noProof/>
+        </w:rPr>
+        <w:drawing>
+          <wp:anchor distT="0" distB="0" distL="114300" distR="114300" simplePos="0" relativeHeight="251714560" behindDoc="0" locked="0" layoutInCell="1" allowOverlap="1" wp14:anchorId="7908AB71" wp14:editId="6253A761">
+            <wp:simplePos x="0" y="0"/>
+            <wp:positionH relativeFrom="margin">
+              <wp:align>left</wp:align>
+            </wp:positionH>
+            <wp:positionV relativeFrom="page">
+              <wp:posOffset>5040713</wp:posOffset>
+            </wp:positionV>
+            <wp:extent cx="1531620" cy="2917190"/>
+            <wp:effectExtent l="0" t="0" r="0" b="0"/>
+            <wp:wrapSquare wrapText="bothSides"/>
+            <wp:docPr id="597196704" name="Picture 6"/>
+            <wp:cNvGraphicFramePr>
+              <a:graphicFrameLocks xmlns:a="http://schemas.openxmlformats.org/drawingml/2006/main" noChangeAspect="1"/>
+            </wp:cNvGraphicFramePr>
+            <a:graphic xmlns:a="http://schemas.openxmlformats.org/drawingml/2006/main">
+              <a:graphicData uri="http://schemas.openxmlformats.org/drawingml/2006/picture">
+                <pic:pic xmlns:pic="http://schemas.openxmlformats.org/drawingml/2006/picture">
+                  <pic:nvPicPr>
+                    <pic:cNvPr id="0" name="Picture 9"/>
+                    <pic:cNvPicPr>
+                      <a:picLocks noChangeAspect="1" noChangeArrowheads="1"/>
+                    </pic:cNvPicPr>
+                  </pic:nvPicPr>
+                  <pic:blipFill>
+                    <a:blip r:embed="rId39">
+                      <a:extLst>
+                        <a:ext uri="{28A0092B-C50C-407E-A947-70E740481C1C}">
+                          <a14:useLocalDpi xmlns:a14="http://schemas.microsoft.com/office/drawing/2010/main" val="0"/>
+                        </a:ext>
+                      </a:extLst>
+                    </a:blip>
+                    <a:srcRect/>
+                    <a:stretch>
+                      <a:fillRect/>
+                    </a:stretch>
+                  </pic:blipFill>
+                  <pic:spPr bwMode="auto">
+                    <a:xfrm>
+                      <a:off x="0" y="0"/>
+                      <a:ext cx="1531620" cy="2917190"/>
+                    </a:xfrm>
+                    <a:prstGeom prst="rect">
+                      <a:avLst/>
+                    </a:prstGeom>
+                    <a:noFill/>
+                  </pic:spPr>
+                </pic:pic>
+              </a:graphicData>
+            </a:graphic>
+            <wp14:sizeRelH relativeFrom="margin">
+              <wp14:pctWidth>0</wp14:pctWidth>
+            </wp14:sizeRelH>
+            <wp14:sizeRelV relativeFrom="margin">
+              <wp14:pctHeight>0</wp14:pctHeight>
+            </wp14:sizeRelV>
+          </wp:anchor>
+        </w:drawing>
+      </w:r>
+      <w:r>
+        <w:rPr>
+          <w:noProof/>
+        </w:rPr>
         <mc:AlternateContent>
           <mc:Choice Requires="wps">
             <w:drawing>
@@ -5260,6 +5357,9 @@
         </mc:AlternateContent>
       </w:r>
       <w:r>
+        <w:rPr>
+          <w:noProof/>
+        </w:rPr>
         <mc:AlternateContent>
           <mc:Choice Requires="wps">
             <w:drawing>
@@ -5302,6 +5402,13 @@
                               </w:rPr>
                             </w:pPr>
                           </w:p>
+                          <w:p>
+                            <w:pPr>
+                              <w:rPr>
+                                <w:lang w:val="en-US"/>
+                              </w:rPr>
+                            </w:pPr>
+                          </w:p>
                         </w:txbxContent>
                       </wps:txbx>
                       <wps:bodyPr rot="0" spcFirstLastPara="0" vertOverflow="clip" horzOverflow="clip" vert="horz" wrap="square" lIns="91440" tIns="45720" rIns="91440" bIns="45720" numCol="1" spcCol="0" rtlCol="0" fromWordArt="0" anchor="t" anchorCtr="0" forceAA="0" compatLnSpc="1">
@@ -5324,9 +5431,20 @@
           </mc:Choice>
           <mc:Fallback>
             <w:pict>
-              <v:shape w14:anchorId="66D89463" id="Text Box 9" o:spid="_x0000_s1027" type="#_x0000_t202" style="position:absolute;margin-left:101.65pt;margin-top:73.4pt;width:62.75pt;height:30.35pt;z-index:251715584;visibility:visible;mso-wrap-style:square;mso-width-percent:0;mso-height-percent:0;mso-wrap-distance-left:9pt;mso-wrap-distance-top:0;mso-wrap-distance-right:9pt;mso-wrap-distance-bottom:0;mso-position-horizontal:absolute;mso-position-horizontal-relative:page;mso-position-vertical:absolute;mso-position-vertical-relative:page;mso-width-percent:0;mso-height-percent:0;mso-width-relative:margin;mso-height-relative:margin;v-text-anchor:top" o:gfxdata="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" filled="f" stroked="f" strokeweight=".5pt">
+              <v:shapetype w14:anchorId="66D89463" id="_x0000_t202" coordsize="21600,21600" o:spt="202" path="m,l,21600r21600,l21600,xe">
+                <v:stroke joinstyle="miter"/>
+                <v:path gradientshapeok="t" o:connecttype="rect"/>
+              </v:shapetype>
+              <v:shape id="Text Box 9" o:spid="_x0000_s1027" type="#_x0000_t202" style="position:absolute;margin-left:101.65pt;margin-top:73.4pt;width:62.75pt;height:30.35pt;z-index:251715584;visibility:visible;mso-wrap-style:square;mso-width-percent:0;mso-height-percent:0;mso-wrap-distance-left:9pt;mso-wrap-distance-top:0;mso-wrap-distance-right:9pt;mso-wrap-distance-bottom:0;mso-position-horizontal:absolute;mso-position-horizontal-relative:page;mso-position-vertical:absolute;mso-position-vertical-relative:page;mso-width-percent:0;mso-height-percent:0;mso-width-relative:margin;mso-height-relative:margin;v-text-anchor:top" o:gfxdata="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" filled="f" stroked="f" strokeweight=".5pt">
                 <v:textbox>
                   <w:txbxContent>
+                    <w:p>
+                      <w:pPr>
+                        <w:rPr>
+                          <w:lang w:val="en-US"/>
+                        </w:rPr>
+                      </w:pPr>
+                    </w:p>
                     <w:p>
                       <w:pPr>
                         <w:rPr>
@@ -5368,85 +5486,18 @@
           <w:lang w:val="en-US"/>
         </w:rPr>
       </w:pPr>
-    </w:p>
-    <w:p>
-      <w:pPr>
-        <w:rPr>
-          <w:sz w:val="2"/>
-          <w:szCs w:val="2"/>
-          <w:lang w:val="en-US"/>
-        </w:rPr>
-      </w:pPr>
-      <w:r>
+      <w:r>
+        <w:rPr>
+          <w:noProof/>
+        </w:rPr>
         <w:drawing>
-          <wp:anchor distT="0" distB="0" distL="114300" distR="114300" simplePos="0" relativeHeight="251714560" behindDoc="0" locked="0" layoutInCell="1" allowOverlap="1" wp14:anchorId="7908AB71" wp14:editId="5E1B3EDE">
+          <wp:anchor distT="0" distB="0" distL="114300" distR="114300" simplePos="0" relativeHeight="251713536" behindDoc="0" locked="0" layoutInCell="1" allowOverlap="1" wp14:anchorId="260DC343" wp14:editId="751FA3A8">
             <wp:simplePos x="0" y="0"/>
             <wp:positionH relativeFrom="margin">
-              <wp:posOffset>3427207</wp:posOffset>
+              <wp:posOffset>-63556</wp:posOffset>
             </wp:positionH>
             <wp:positionV relativeFrom="page">
-              <wp:posOffset>1335592</wp:posOffset>
-            </wp:positionV>
-            <wp:extent cx="1531620" cy="2917190"/>
-            <wp:effectExtent l="0" t="0" r="0" b="0"/>
-            <wp:wrapSquare wrapText="bothSides"/>
-            <wp:docPr id="597196704" name="Picture 6"/>
-            <wp:cNvGraphicFramePr>
-              <a:graphicFrameLocks xmlns:a="http://schemas.openxmlformats.org/drawingml/2006/main" noChangeAspect="1"/>
-            </wp:cNvGraphicFramePr>
-            <a:graphic xmlns:a="http://schemas.openxmlformats.org/drawingml/2006/main">
-              <a:graphicData uri="http://schemas.openxmlformats.org/drawingml/2006/picture">
-                <pic:pic xmlns:pic="http://schemas.openxmlformats.org/drawingml/2006/picture">
-                  <pic:nvPicPr>
-                    <pic:cNvPr id="0" name="Picture 9"/>
-                    <pic:cNvPicPr>
-                      <a:picLocks noChangeAspect="1" noChangeArrowheads="1"/>
-                    </pic:cNvPicPr>
-                  </pic:nvPicPr>
-                  <pic:blipFill>
-                    <a:blip r:embed="rId39">
-                      <a:extLst>
-                        <a:ext uri="{28A0092B-C50C-407E-A947-70E740481C1C}">
-                          <a14:useLocalDpi xmlns:a14="http://schemas.microsoft.com/office/drawing/2010/main" val="0"/>
-                        </a:ext>
-                      </a:extLst>
-                    </a:blip>
-                    <a:srcRect/>
-                    <a:stretch>
-                      <a:fillRect/>
-                    </a:stretch>
-                  </pic:blipFill>
-                  <pic:spPr bwMode="auto">
-                    <a:xfrm>
-                      <a:off x="0" y="0"/>
-                      <a:ext cx="1531620" cy="2917190"/>
-                    </a:xfrm>
-                    <a:prstGeom prst="rect">
-                      <a:avLst/>
-                    </a:prstGeom>
-                    <a:noFill/>
-                  </pic:spPr>
-                </pic:pic>
-              </a:graphicData>
-            </a:graphic>
-            <wp14:sizeRelH relativeFrom="margin">
-              <wp14:pctWidth>0</wp14:pctWidth>
-            </wp14:sizeRelH>
-            <wp14:sizeRelV relativeFrom="margin">
-              <wp14:pctHeight>0</wp14:pctHeight>
-            </wp14:sizeRelV>
-          </wp:anchor>
-        </w:drawing>
-      </w:r>
-      <w:r>
-        <w:drawing>
-          <wp:anchor distT="0" distB="0" distL="114300" distR="114300" simplePos="0" relativeHeight="251713536" behindDoc="0" locked="0" layoutInCell="1" allowOverlap="1" wp14:anchorId="260DC343" wp14:editId="7B293DFD">
-            <wp:simplePos x="0" y="0"/>
-            <wp:positionH relativeFrom="margin">
-              <wp:align>left</wp:align>
-            </wp:positionH>
-            <wp:positionV relativeFrom="page">
-              <wp:posOffset>1319530</wp:posOffset>
+              <wp:posOffset>1589350</wp:posOffset>
             </wp:positionV>
             <wp:extent cx="1887220" cy="2917190"/>
             <wp:effectExtent l="0" t="0" r="0" b="0"/>
@@ -5728,21 +5779,52 @@
     <w:p>
       <w:pPr>
         <w:rPr>
-          <w:lang w:val="en-US"/>
-        </w:rPr>
-      </w:pPr>
-    </w:p>
-    <w:p>
-      <w:pPr>
-        <w:rPr>
-          <w:lang w:val="en-US"/>
-        </w:rPr>
-      </w:pPr>
-      <w:proofErr w:type="spellStart"/>
-      <w:r>
-        <w:rPr>
-          <w:lang w:val="en-US"/>
-        </w:rPr>
+          <w:sz w:val="2"/>
+          <w:szCs w:val="2"/>
+          <w:lang w:val="en-US"/>
+        </w:rPr>
+      </w:pPr>
+    </w:p>
+    <w:p>
+      <w:pPr>
+        <w:rPr>
+          <w:lang w:val="en-US"/>
+        </w:rPr>
+      </w:pPr>
+    </w:p>
+    <w:p>
+      <w:pPr>
+        <w:rPr>
+          <w:lang w:val="en-US"/>
+        </w:rPr>
+      </w:pPr>
+    </w:p>
+    <w:p>
+      <w:pPr>
+        <w:rPr>
+          <w:lang w:val="en-US"/>
+        </w:rPr>
+      </w:pPr>
+    </w:p>
+    <w:p>
+      <w:pPr>
+        <w:rPr>
+          <w:lang w:val="en-US"/>
+        </w:rPr>
+      </w:pPr>
+    </w:p>
+    <w:p>
+      <w:pPr>
+        <w:rPr>
+          <w:lang w:val="en-US"/>
+        </w:rPr>
+      </w:pPr>
+      <w:proofErr w:type="spellStart"/>
+      <w:r>
+        <w:rPr>
+          <w:lang w:val="en-US"/>
+        </w:rPr>
+        <w:lastRenderedPageBreak/>
         <w:t>Doxygen</w:t>
       </w:r>
       <w:proofErr w:type="spellEnd"/>
@@ -7212,6 +7294,7 @@
   <w:style w:type="character" w:default="1" w:styleId="DefaultParagraphFont">
     <w:name w:val="Default Paragraph Font"/>
     <w:uiPriority w:val="1"/>
+    <w:semiHidden/>
     <w:unhideWhenUsed/>
   </w:style>
   <w:style w:type="table" w:default="1" w:styleId="TableNormal">

</xml_diff>

<commit_message>
Update COS 214 Practical 3 PDF Pre-Final.docx
</commit_message>
<xml_diff>
--- a/COS 214 Practical 3 PDF Pre-Final.docx
+++ b/COS 214 Practical 3 PDF Pre-Final.docx
@@ -205,17 +205,37 @@
         </w:rPr>
         <w:t>Brett Pitts</w:t>
       </w:r>
-    </w:p>
-    <w:p>
-      <w:pPr>
-        <w:rPr>
-          <w:lang w:val="en-US"/>
-        </w:rPr>
-      </w:pPr>
-    </w:p>
-    <w:p>
-      <w:r>
-        <w:t>1.1 PixelCon is a one-day gaming convention held across a single indoor/outdoor venue. Attendees move between gaming halls, a competitive tournament zone, and an outdoor plaza containing food, merchandise, and ticketing. The event runs on a live coordination system: a central control point can issue notices</w:t>
+      <w:r>
+        <w:rPr>
+          <w:lang w:val="en-US"/>
+        </w:rPr>
+        <w:t xml:space="preserve"> – u24682251</w:t>
+      </w:r>
+    </w:p>
+    <w:p>
+      <w:pPr>
+        <w:rPr>
+          <w:lang w:val="en-US"/>
+        </w:rPr>
+      </w:pPr>
+    </w:p>
+    <w:p>
+      <w:r>
+        <w:t xml:space="preserve">1.1 </w:t>
+      </w:r>
+      <w:proofErr w:type="spellStart"/>
+      <w:r>
+        <w:t>PixelCon</w:t>
+      </w:r>
+      <w:proofErr w:type="spellEnd"/>
+      <w:r>
+        <w:t xml:space="preserve"> is a </w:t>
+      </w:r>
+      <w:r>
+        <w:t>multi</w:t>
+      </w:r>
+      <w:r>
+        <w:t>-day gaming convention held across a single indoor/outdoor venue. Attendees move between gaming halls, a competitive tournament zone, and an outdoor plaza containing food, merchandise, and ticketing. The event runs on a live coordination system: a central control point can issue notices</w:t>
       </w:r>
       <w:r>
         <w:t>,</w:t>
@@ -242,7 +262,17 @@
       </w:r>
     </w:p>
     <w:p>
-      <w:r>
+      <w:pPr>
+        <w:rPr>
+          <w:b/>
+          <w:bCs/>
+        </w:rPr>
+      </w:pPr>
+      <w:r>
+        <w:rPr>
+          <w:b/>
+          <w:bCs/>
+        </w:rPr>
         <w:t>Groupings / areas</w:t>
       </w:r>
     </w:p>
@@ -301,7 +331,18 @@
       </w:r>
     </w:p>
     <w:p>
-      <w:r>
+      <w:pPr>
+        <w:rPr>
+          <w:b/>
+          <w:bCs/>
+        </w:rPr>
+      </w:pPr>
+      <w:r>
+        <w:rPr>
+          <w:b/>
+          <w:bCs/>
+        </w:rPr>
+        <w:lastRenderedPageBreak/>
         <w:t>Concrete event units</w:t>
       </w:r>
     </w:p>
@@ -313,7 +354,6 @@
         </w:numPr>
       </w:pPr>
       <w:r>
-        <w:lastRenderedPageBreak/>
         <w:t xml:space="preserve">PC Station — a desktop gaming seat. Indoor unit; ignores weather alerts </w:t>
       </w:r>
       <w:proofErr w:type="gramStart"/>
@@ -363,7 +403,7 @@
       </w:r>
       <w:proofErr w:type="gramEnd"/>
       <w:r>
-        <w:t xml:space="preserve"> pauses new sessions (without cutting off an in-progress one) during a capacity alert.</w:t>
+        <w:t xml:space="preserve"> pauses new sessions during a capacity alert.</w:t>
       </w:r>
     </w:p>
     <w:p>
@@ -402,15 +442,7 @@
         </w:numPr>
       </w:pPr>
       <w:r>
-        <w:t xml:space="preserve">Merch Vendor — reinterprets "capacity" as remaining stock rather than </w:t>
-      </w:r>
-      <w:proofErr w:type="gramStart"/>
-      <w:r>
-        <w:t>headcount, and</w:t>
-      </w:r>
-      <w:proofErr w:type="gramEnd"/>
-      <w:r>
-        <w:t xml:space="preserve"> flags itself for restock during a capacity alert.</w:t>
+        <w:t>Merch Vendor —flags itself for restock during a capacity alert.</w:t>
       </w:r>
     </w:p>
     <w:p>
@@ -421,15 +453,7 @@
         </w:numPr>
       </w:pPr>
       <w:r>
-        <w:t xml:space="preserve">Food Vendor — the one indoor-vs-outdoor-sensitive vendor: </w:t>
-      </w:r>
-      <w:proofErr w:type="gramStart"/>
-      <w:r>
-        <w:t>actually</w:t>
-      </w:r>
-      <w:proofErr w:type="gramEnd"/>
-      <w:r>
-        <w:t xml:space="preserve"> closes on a weather </w:t>
+        <w:t xml:space="preserve">Food Vendor —closes on a weather </w:t>
       </w:r>
       <w:proofErr w:type="spellStart"/>
       <w:proofErr w:type="gramStart"/>
@@ -471,13 +495,13 @@
           <w:noProof/>
         </w:rPr>
         <w:drawing>
-          <wp:anchor distT="0" distB="0" distL="114300" distR="114300" simplePos="0" relativeHeight="251663360" behindDoc="0" locked="0" layoutInCell="1" allowOverlap="1" wp14:anchorId="77BDB7A0" wp14:editId="654182F6">
+          <wp:anchor distT="0" distB="0" distL="114300" distR="114300" simplePos="0" relativeHeight="251663360" behindDoc="0" locked="0" layoutInCell="1" allowOverlap="1" wp14:anchorId="77BDB7A0" wp14:editId="3F5DD593">
             <wp:simplePos x="0" y="0"/>
             <wp:positionH relativeFrom="margin">
-              <wp:align>center</wp:align>
+              <wp:posOffset>-614045</wp:posOffset>
             </wp:positionH>
             <wp:positionV relativeFrom="page">
-              <wp:posOffset>7171652</wp:posOffset>
+              <wp:posOffset>6713855</wp:posOffset>
             </wp:positionV>
             <wp:extent cx="7112280" cy="341194"/>
             <wp:effectExtent l="0" t="0" r="0" b="1905"/>
@@ -805,13 +829,31 @@
     </w:p>
     <w:p/>
     <w:p>
-      <w:r>
+      <w:pPr>
+        <w:rPr>
+          <w:b/>
+          <w:bCs/>
+        </w:rPr>
+      </w:pPr>
+      <w:r>
+        <w:rPr>
+          <w:b/>
+          <w:bCs/>
+        </w:rPr>
         <w:t>EventGroup</w:t>
       </w:r>
       <w:r>
+        <w:rPr>
+          <w:b/>
+          <w:bCs/>
+        </w:rPr>
         <w:t xml:space="preserve"> </w:t>
       </w:r>
       <w:r>
+        <w:rPr>
+          <w:b/>
+          <w:bCs/>
+        </w:rPr>
         <w:t>participates in three roles:</w:t>
       </w:r>
     </w:p>
@@ -865,24 +907,40 @@
       </w:r>
     </w:p>
     <w:p>
-      <w:proofErr w:type="spellStart"/>
-      <w:r>
+      <w:pPr>
+        <w:rPr>
+          <w:b/>
+          <w:bCs/>
+        </w:rPr>
+      </w:pPr>
+      <w:proofErr w:type="spellStart"/>
+      <w:r>
+        <w:rPr>
+          <w:b/>
+          <w:bCs/>
+        </w:rPr>
         <w:t>EventUnit</w:t>
       </w:r>
       <w:proofErr w:type="spellEnd"/>
       <w:r>
-        <w:t xml:space="preserve"> (and</w:t>
-      </w:r>
-      <w:r>
-        <w:t xml:space="preserve"> </w:t>
-      </w:r>
-      <w:r>
-        <w:t>every concrete leaf)</w:t>
-      </w:r>
-      <w:r>
+        <w:rPr>
+          <w:b/>
+          <w:bCs/>
+        </w:rPr>
+        <w:t xml:space="preserve"> (and every concrete leaf)</w:t>
+      </w:r>
+      <w:r>
+        <w:rPr>
+          <w:b/>
+          <w:bCs/>
+        </w:rPr>
         <w:t>,</w:t>
       </w:r>
       <w:r>
+        <w:rPr>
+          <w:b/>
+          <w:bCs/>
+        </w:rPr>
         <w:t>participates in two roles:</w:t>
       </w:r>
     </w:p>
@@ -917,55 +975,12 @@
       </w:r>
       <w:proofErr w:type="gramStart"/>
       <w:r>
-        <w:t>attach(</w:t>
+        <w:t>attach</w:t>
       </w:r>
       <w:proofErr w:type="gramEnd"/>
       <w:r>
-        <w:t xml:space="preserve">)ed to whichever EventGroup contains it and reacts to notices via </w:t>
-      </w:r>
-      <w:proofErr w:type="gramStart"/>
-      <w:r>
-        <w:t>update(</w:t>
-      </w:r>
-      <w:proofErr w:type="gramEnd"/>
-      <w:r>
-        <w:t>).</w:t>
-      </w:r>
-    </w:p>
-    <w:p>
-      <w:pPr>
-        <w:rPr>
-          <w:lang w:val="en-US"/>
-        </w:rPr>
-      </w:pPr>
-    </w:p>
-    <w:p>
-      <w:pPr>
-        <w:rPr>
-          <w:lang w:val="en-US"/>
-        </w:rPr>
-      </w:pPr>
-    </w:p>
-    <w:p>
-      <w:pPr>
-        <w:rPr>
-          <w:lang w:val="en-US"/>
-        </w:rPr>
-      </w:pPr>
-    </w:p>
-    <w:p>
-      <w:pPr>
-        <w:rPr>
-          <w:lang w:val="en-US"/>
-        </w:rPr>
-      </w:pPr>
-    </w:p>
-    <w:p>
-      <w:pPr>
-        <w:rPr>
-          <w:lang w:val="en-US"/>
-        </w:rPr>
-      </w:pPr>
+        <w:t>()ed to whichever EventGroup contains it and reacts to notices via update().</w:t>
+      </w:r>
     </w:p>
     <w:p>
       <w:pPr>
@@ -1017,7 +1032,7 @@
     </w:p>
     <w:p>
       <w:pPr>
-        <w:jc w:val="center"/>
+        <w:ind w:left="2160"/>
         <w:rPr>
           <w:lang w:val="en-US"/>
         </w:rPr>
@@ -1098,9 +1113,9 @@
           <w:lang w:val="en-US"/>
         </w:rPr>
         <w:drawing>
-          <wp:inline distT="0" distB="0" distL="0" distR="0" wp14:anchorId="5F54BA9E" wp14:editId="30CD2A56">
-            <wp:extent cx="6149788" cy="5293028"/>
-            <wp:effectExtent l="0" t="0" r="3810" b="3175"/>
+          <wp:inline distT="0" distB="0" distL="0" distR="0" wp14:anchorId="5F54BA9E" wp14:editId="7ABD8A39">
+            <wp:extent cx="6285925" cy="5410200"/>
+            <wp:effectExtent l="0" t="0" r="635" b="0"/>
             <wp:docPr id="859365253" name="Picture 1"/>
             <wp:cNvGraphicFramePr>
               <a:graphicFrameLocks xmlns:a="http://schemas.openxmlformats.org/drawingml/2006/main" noChangeAspect="1"/>
@@ -1121,7 +1136,7 @@
                   <pic:spPr>
                     <a:xfrm>
                       <a:off x="0" y="0"/>
-                      <a:ext cx="6155567" cy="5298002"/>
+                      <a:ext cx="6285925" cy="5410200"/>
                     </a:xfrm>
                     <a:prstGeom prst="rect">
                       <a:avLst/>
@@ -1623,122 +1638,21 @@
     <w:p/>
     <w:p>
       <w:r>
-        <w:t xml:space="preserve">If an object is transferred between composites, the ownership rule </w:t>
-      </w:r>
-      <w:proofErr w:type="gramStart"/>
-      <w:r>
-        <w:t>is:</w:t>
-      </w:r>
-      <w:proofErr w:type="gramEnd"/>
-      <w:r>
-        <w:t xml:space="preserve"> only one </w:t>
-      </w:r>
-      <w:proofErr w:type="spellStart"/>
-      <w:r>
-        <w:t>EventGroup</w:t>
-      </w:r>
-      <w:proofErr w:type="spellEnd"/>
-      <w:r>
-        <w:t xml:space="preserve"> may own it at any moment. </w:t>
-      </w:r>
-      <w:proofErr w:type="spellStart"/>
-      <w:r>
-        <w:t>removeChildren</w:t>
-      </w:r>
-      <w:proofErr w:type="spellEnd"/>
-      <w:r>
-        <w:t>(child) hands ownership back to the caller without deleting it (</w:t>
-      </w:r>
-      <w:proofErr w:type="gramStart"/>
-      <w:r>
-        <w:t>and also</w:t>
-      </w:r>
-      <w:proofErr w:type="gramEnd"/>
-      <w:r>
-        <w:t xml:space="preserve"> detaches the child as an observer if it was registered), and the caller must immediately re-parent it via another group's </w:t>
-      </w:r>
-      <w:proofErr w:type="spellStart"/>
-      <w:r>
-        <w:t>addChildren</w:t>
-      </w:r>
-      <w:proofErr w:type="spellEnd"/>
-      <w:r>
-        <w:t xml:space="preserve">(child) before that pointer is dropped. This is exactly what happens in main.cpp when </w:t>
-      </w:r>
-      <w:proofErr w:type="spellStart"/>
-      <w:r>
-        <w:t>mobileStation</w:t>
-      </w:r>
-      <w:proofErr w:type="spellEnd"/>
-      <w:r>
-        <w:t xml:space="preserve"> is relocated from </w:t>
-      </w:r>
-      <w:proofErr w:type="spellStart"/>
-      <w:r>
-        <w:t>outdoorPlaza</w:t>
-      </w:r>
-      <w:proofErr w:type="spellEnd"/>
-      <w:r>
-        <w:t xml:space="preserve"> to </w:t>
-      </w:r>
-      <w:proofErr w:type="spellStart"/>
-      <w:r>
-        <w:t>consoleHall</w:t>
-      </w:r>
-      <w:proofErr w:type="spellEnd"/>
-      <w:r>
-        <w:t xml:space="preserve">: </w:t>
-      </w:r>
-      <w:proofErr w:type="spellStart"/>
-      <w:r>
-        <w:t>outdoorPlaza</w:t>
-      </w:r>
-      <w:proofErr w:type="spellEnd"/>
-      <w:r>
-        <w:t>-&gt;</w:t>
-      </w:r>
-      <w:proofErr w:type="spellStart"/>
-      <w:r>
-        <w:t>removeChildren</w:t>
-      </w:r>
-      <w:proofErr w:type="spellEnd"/>
-      <w:r>
-        <w:t>(</w:t>
-      </w:r>
-      <w:proofErr w:type="spellStart"/>
-      <w:r>
-        <w:t>mobileStation</w:t>
-      </w:r>
-      <w:proofErr w:type="spellEnd"/>
-      <w:r>
-        <w:t xml:space="preserve">) releases ownership, then </w:t>
-      </w:r>
-      <w:proofErr w:type="spellStart"/>
-      <w:r>
-        <w:t>consoleHall</w:t>
-      </w:r>
-      <w:proofErr w:type="spellEnd"/>
-      <w:r>
-        <w:t>-&gt;</w:t>
-      </w:r>
-      <w:proofErr w:type="spellStart"/>
-      <w:r>
-        <w:t>addChildren</w:t>
-      </w:r>
-      <w:proofErr w:type="spellEnd"/>
-      <w:r>
-        <w:t>(relocated) re-establishes it, so the object is never owned by two groups at once and never left owned by none.</w:t>
-      </w:r>
-    </w:p>
-    <w:p>
-      <w:r>
         <w:rPr>
           <w:noProof/>
         </w:rPr>
         <w:drawing>
-          <wp:inline distT="0" distB="0" distL="0" distR="0" wp14:anchorId="42D7D706" wp14:editId="1B515DC3">
-            <wp:extent cx="5731510" cy="300355"/>
-            <wp:effectExtent l="0" t="0" r="2540" b="4445"/>
+          <wp:anchor distT="0" distB="0" distL="114300" distR="114300" simplePos="0" relativeHeight="251724800" behindDoc="0" locked="0" layoutInCell="1" allowOverlap="1" wp14:anchorId="42D7D706" wp14:editId="448BC7C4">
+            <wp:simplePos x="0" y="0"/>
+            <wp:positionH relativeFrom="column">
+              <wp:posOffset>-304800</wp:posOffset>
+            </wp:positionH>
+            <wp:positionV relativeFrom="page">
+              <wp:posOffset>5633085</wp:posOffset>
+            </wp:positionV>
+            <wp:extent cx="6457950" cy="338455"/>
+            <wp:effectExtent l="0" t="0" r="0" b="4445"/>
+            <wp:wrapSquare wrapText="bothSides"/>
             <wp:docPr id="167545485" name="Picture 1"/>
             <wp:cNvGraphicFramePr>
               <a:graphicFrameLocks xmlns:a="http://schemas.openxmlformats.org/drawingml/2006/main" noChangeAspect="1"/>
@@ -1751,7 +1665,13 @@
                     <pic:cNvPicPr/>
                   </pic:nvPicPr>
                   <pic:blipFill>
-                    <a:blip r:embed="rId16"/>
+                    <a:blip r:embed="rId16">
+                      <a:extLst>
+                        <a:ext uri="{28A0092B-C50C-407E-A947-70E740481C1C}">
+                          <a14:useLocalDpi xmlns:a14="http://schemas.microsoft.com/office/drawing/2010/main" val="0"/>
+                        </a:ext>
+                      </a:extLst>
+                    </a:blip>
                     <a:stretch>
                       <a:fillRect/>
                     </a:stretch>
@@ -1759,7 +1679,7 @@
                   <pic:spPr>
                     <a:xfrm>
                       <a:off x="0" y="0"/>
-                      <a:ext cx="5731510" cy="300355"/>
+                      <a:ext cx="6457950" cy="338455"/>
                     </a:xfrm>
                     <a:prstGeom prst="rect">
                       <a:avLst/>
@@ -1768,193 +1688,289 @@
                 </pic:pic>
               </a:graphicData>
             </a:graphic>
-          </wp:inline>
+            <wp14:sizeRelH relativeFrom="page">
+              <wp14:pctWidth>0</wp14:pctWidth>
+            </wp14:sizeRelH>
+            <wp14:sizeRelV relativeFrom="page">
+              <wp14:pctHeight>0</wp14:pctHeight>
+            </wp14:sizeRelV>
+          </wp:anchor>
         </w:drawing>
       </w:r>
-    </w:p>
-    <w:p>
+      <w:r>
+        <w:t xml:space="preserve">If an object is transferred between composites, the ownership rule </w:t>
+      </w:r>
+      <w:proofErr w:type="gramStart"/>
+      <w:r>
+        <w:t>is:</w:t>
+      </w:r>
+      <w:proofErr w:type="gramEnd"/>
+      <w:r>
+        <w:t xml:space="preserve"> only one </w:t>
+      </w:r>
+      <w:proofErr w:type="spellStart"/>
+      <w:r>
+        <w:t>EventGroup</w:t>
+      </w:r>
+      <w:proofErr w:type="spellEnd"/>
+      <w:r>
+        <w:t xml:space="preserve"> may own it at any moment. </w:t>
+      </w:r>
+      <w:proofErr w:type="spellStart"/>
+      <w:r>
+        <w:t>removeChildren</w:t>
+      </w:r>
+      <w:proofErr w:type="spellEnd"/>
+      <w:r>
+        <w:t>(child) hands ownership back to the caller without deleting it (</w:t>
+      </w:r>
+      <w:proofErr w:type="gramStart"/>
+      <w:r>
+        <w:t>and also</w:t>
+      </w:r>
+      <w:proofErr w:type="gramEnd"/>
+      <w:r>
+        <w:t xml:space="preserve"> detaches the child as an observer if it was registered), and the caller must immediately re-parent it via another group's </w:t>
+      </w:r>
+      <w:proofErr w:type="spellStart"/>
+      <w:r>
+        <w:t>addChildren</w:t>
+      </w:r>
+      <w:proofErr w:type="spellEnd"/>
+      <w:r>
+        <w:t xml:space="preserve">(child) before that pointer is dropped. This is exactly what happens in main.cpp when </w:t>
+      </w:r>
+      <w:proofErr w:type="spellStart"/>
+      <w:r>
+        <w:t>mobileStation</w:t>
+      </w:r>
+      <w:proofErr w:type="spellEnd"/>
+      <w:r>
+        <w:t xml:space="preserve"> is relocated from </w:t>
+      </w:r>
+      <w:proofErr w:type="spellStart"/>
+      <w:r>
+        <w:t>outdoorPlaza</w:t>
+      </w:r>
+      <w:proofErr w:type="spellEnd"/>
+      <w:r>
+        <w:t xml:space="preserve"> to </w:t>
+      </w:r>
+      <w:proofErr w:type="spellStart"/>
+      <w:r>
+        <w:t>consoleHall</w:t>
+      </w:r>
+      <w:proofErr w:type="spellEnd"/>
+      <w:r>
+        <w:t xml:space="preserve">: </w:t>
+      </w:r>
+      <w:proofErr w:type="spellStart"/>
+      <w:r>
+        <w:t>outdoorPlaza</w:t>
+      </w:r>
+      <w:proofErr w:type="spellEnd"/>
+      <w:r>
+        <w:t>-&gt;</w:t>
+      </w:r>
+      <w:proofErr w:type="spellStart"/>
+      <w:r>
+        <w:t>removeChildren</w:t>
+      </w:r>
+      <w:proofErr w:type="spellEnd"/>
+      <w:r>
+        <w:t>(</w:t>
+      </w:r>
+      <w:proofErr w:type="spellStart"/>
+      <w:r>
+        <w:t>mobileStation</w:t>
+      </w:r>
+      <w:proofErr w:type="spellEnd"/>
+      <w:r>
+        <w:t xml:space="preserve">) releases ownership, then </w:t>
+      </w:r>
+      <w:proofErr w:type="spellStart"/>
+      <w:r>
+        <w:t>consoleHall</w:t>
+      </w:r>
+      <w:proofErr w:type="spellEnd"/>
+      <w:r>
+        <w:t>-&gt;</w:t>
+      </w:r>
+      <w:proofErr w:type="spellStart"/>
+      <w:r>
+        <w:t>addChildren</w:t>
+      </w:r>
+      <w:proofErr w:type="spellEnd"/>
+      <w:r>
+        <w:t>(relocated) re-establishes it, so the object is never owned by two groups at once and never left owned by none.</w:t>
+      </w:r>
+    </w:p>
+    <w:p/>
+    <w:p>
+      <w:r>
+        <w:t xml:space="preserve">3.1 </w:t>
+      </w:r>
       <w:r>
         <w:t xml:space="preserve">attach(observer) first rejects </w:t>
       </w:r>
-      <w:proofErr w:type="spellStart"/>
-      <w:r>
-        <w:t>nullptr</w:t>
-      </w:r>
-      <w:proofErr w:type="spellEnd"/>
-      <w:r>
-        <w:t xml:space="preserve">, then linearly scans observers for the pointer already being present; if it's found, </w:t>
+      <w:r>
+        <w:t>NULL,</w:t>
+      </w:r>
+      <w:r>
+        <w:t xml:space="preserve"> then linearly scans observers for the pointer already being present; if it's found, attach() is a no-op and the observer is not added twice — this prevents notify() from ever calling update() on the same observer more than once per notice. If the pointer isn't already registered, it's pushed onto the back of the vector.</w:t>
+      </w:r>
+    </w:p>
+    <w:p/>
+    <w:p>
+      <w:r>
+        <w:t>detach(observer) scans for a matching pointer and erases it if found; if the observer was never registered (or was already detached), detach() simply does nothing and returns — no error, no crash, just a safe no-op either way.</w:t>
+      </w:r>
+    </w:p>
+    <w:p/>
+    <w:p>
+      <w:r>
+        <w:t xml:space="preserve">Both methods treat observers purely as a set of raw, non-owning identities: Subject never owns or deletes what these pointers point to (see ~Subject(), which only calls </w:t>
+      </w:r>
+      <w:proofErr w:type="spellStart"/>
+      <w:r>
+        <w:t>observers.clear</w:t>
+      </w:r>
+      <w:proofErr w:type="spellEnd"/>
+      <w:r>
+        <w:t xml:space="preserve">()), so attach/detach are just membership toggles on that list, not lifetime operations. This keeps the policy simple and predictable: calling attach() twice </w:t>
+      </w:r>
+      <w:r>
+        <w:lastRenderedPageBreak/>
+        <w:t>is harmless, calling detach() on something not present is harmless, and neither can leave the list in an inconsistent state.</w:t>
+      </w:r>
+    </w:p>
+    <w:p>
+      <w:r>
+        <w:drawing>
+          <wp:anchor distT="0" distB="0" distL="114300" distR="114300" simplePos="0" relativeHeight="251718656" behindDoc="0" locked="0" layoutInCell="1" allowOverlap="1" wp14:anchorId="72102378" wp14:editId="30EF9A5F">
+            <wp:simplePos x="0" y="0"/>
+            <wp:positionH relativeFrom="margin">
+              <wp:align>right</wp:align>
+            </wp:positionH>
+            <wp:positionV relativeFrom="margin">
+              <wp:posOffset>742950</wp:posOffset>
+            </wp:positionV>
+            <wp:extent cx="5731510" cy="418465"/>
+            <wp:effectExtent l="0" t="0" r="2540" b="635"/>
+            <wp:wrapSquare wrapText="bothSides"/>
+            <wp:docPr id="1890177349" name="Picture 1"/>
+            <wp:cNvGraphicFramePr>
+              <a:graphicFrameLocks xmlns:a="http://schemas.openxmlformats.org/drawingml/2006/main" noChangeAspect="1"/>
+            </wp:cNvGraphicFramePr>
+            <a:graphic xmlns:a="http://schemas.openxmlformats.org/drawingml/2006/main">
+              <a:graphicData uri="http://schemas.openxmlformats.org/drawingml/2006/picture">
+                <pic:pic xmlns:pic="http://schemas.openxmlformats.org/drawingml/2006/picture">
+                  <pic:nvPicPr>
+                    <pic:cNvPr id="1890177349" name=""/>
+                    <pic:cNvPicPr/>
+                  </pic:nvPicPr>
+                  <pic:blipFill>
+                    <a:blip r:embed="rId17"/>
+                    <a:stretch>
+                      <a:fillRect/>
+                    </a:stretch>
+                  </pic:blipFill>
+                  <pic:spPr>
+                    <a:xfrm>
+                      <a:off x="0" y="0"/>
+                      <a:ext cx="5731510" cy="418465"/>
+                    </a:xfrm>
+                    <a:prstGeom prst="rect">
+                      <a:avLst/>
+                    </a:prstGeom>
+                  </pic:spPr>
+                </pic:pic>
+              </a:graphicData>
+            </a:graphic>
+            <wp14:sizeRelH relativeFrom="margin">
+              <wp14:pctWidth>0</wp14:pctWidth>
+            </wp14:sizeRelH>
+            <wp14:sizeRelV relativeFrom="margin">
+              <wp14:pctHeight>0</wp14:pctHeight>
+            </wp14:sizeRelV>
+          </wp:anchor>
+        </w:drawing>
+      </w:r>
+    </w:p>
+    <w:p/>
+    <w:p>
+      <w:pPr>
+        <w:jc w:val="both"/>
+      </w:pPr>
+      <w:r>
+        <w:t>3.2)</w:t>
+      </w:r>
+    </w:p>
+    <w:p>
+      <w:pPr>
+        <w:jc w:val="both"/>
+      </w:pPr>
+      <w:r>
+        <w:t>Observer implementation and lifetime safety. Observer is a pure abstract base with one pure virtual method, update(</w:t>
+      </w:r>
+      <w:proofErr w:type="spellStart"/>
+      <w:r>
+        <w:t>const</w:t>
+      </w:r>
+      <w:proofErr w:type="spellEnd"/>
+      <w:r>
+        <w:t xml:space="preserve"> Notice&amp;), and a virtual destructor that does nothing itself (</w:t>
       </w:r>
       <w:proofErr w:type="gramStart"/>
       <w:r>
-        <w:t>attach(</w:t>
+        <w:t>Observer::</w:t>
       </w:r>
       <w:proofErr w:type="gramEnd"/>
       <w:r>
-        <w:t xml:space="preserve">) is a no-op and the observer is not added twice — this prevents </w:t>
-      </w:r>
+        <w:t>~Observer(){})</w:t>
+      </w:r>
+      <w:r>
+        <w:t>,</w:t>
+      </w:r>
+      <w:r>
+        <w:t xml:space="preserve"> it holds no state, so there's nothing for it to clean up on its own. </w:t>
+      </w:r>
+      <w:proofErr w:type="spellStart"/>
+      <w:r>
+        <w:t>EventUnit</w:t>
+      </w:r>
+      <w:proofErr w:type="spellEnd"/>
+      <w:r>
+        <w:t xml:space="preserve"> inherits from both </w:t>
+      </w:r>
+      <w:proofErr w:type="spellStart"/>
+      <w:r>
+        <w:t>EventComponent</w:t>
+      </w:r>
+      <w:proofErr w:type="spellEnd"/>
+      <w:r>
+        <w:t xml:space="preserve"> and Observer, giving every concrete leaf a dual role: Leaf in the Composite tree, and </w:t>
+      </w:r>
+      <w:proofErr w:type="spellStart"/>
+      <w:r>
+        <w:t>ConcreteObserver</w:t>
+      </w:r>
+      <w:proofErr w:type="spellEnd"/>
+      <w:r>
+        <w:t xml:space="preserve"> reacting to notices. </w:t>
+      </w:r>
+      <w:proofErr w:type="spellStart"/>
       <w:proofErr w:type="gramStart"/>
       <w:r>
-        <w:t>notify(</w:t>
+        <w:t>EventUnit</w:t>
+      </w:r>
+      <w:proofErr w:type="spellEnd"/>
+      <w:r>
+        <w:t>::</w:t>
       </w:r>
       <w:proofErr w:type="gramEnd"/>
       <w:r>
-        <w:t xml:space="preserve">) from ever calling </w:t>
-      </w:r>
-      <w:proofErr w:type="gramStart"/>
-      <w:r>
-        <w:t>update(</w:t>
-      </w:r>
-      <w:proofErr w:type="gramEnd"/>
-      <w:r>
-        <w:t>) on the same observer more than once per notice. If the pointer isn't already registered, it's pushed onto the back of the vector.</w:t>
-      </w:r>
-    </w:p>
-    <w:p/>
-    <w:p>
-      <w:r>
-        <w:t xml:space="preserve">detach(observer) scans for a matching pointer and erases it if found; if the observer was never registered (or was already detached), </w:t>
-      </w:r>
-      <w:proofErr w:type="gramStart"/>
-      <w:r>
-        <w:t>detach(</w:t>
-      </w:r>
-      <w:proofErr w:type="gramEnd"/>
-      <w:r>
-        <w:t>) simply does nothing and returns — no error, no crash, just a safe no-op either way.</w:t>
-      </w:r>
-    </w:p>
-    <w:p/>
-    <w:p>
-      <w:r>
-        <w:t>Both methods treat observers purely as a set of raw, non-owning identities: Subject never owns or deletes what these pointers point to (see ~</w:t>
-      </w:r>
-      <w:proofErr w:type="gramStart"/>
-      <w:r>
-        <w:t>Subject(</w:t>
-      </w:r>
-      <w:proofErr w:type="gramEnd"/>
-      <w:r>
-        <w:t xml:space="preserve">), which only calls </w:t>
-      </w:r>
-      <w:proofErr w:type="spellStart"/>
-      <w:proofErr w:type="gramStart"/>
-      <w:r>
-        <w:t>observers.clear</w:t>
-      </w:r>
-      <w:proofErr w:type="spellEnd"/>
-      <w:proofErr w:type="gramEnd"/>
-      <w:r>
-        <w:t xml:space="preserve">()), so attach/detach are just membership toggles on that list, not lifetime operations. This keeps the policy simple and predictable: calling </w:t>
-      </w:r>
-      <w:proofErr w:type="gramStart"/>
-      <w:r>
-        <w:t>attach(</w:t>
-      </w:r>
-      <w:proofErr w:type="gramEnd"/>
-      <w:r>
-        <w:t xml:space="preserve">) twice </w:t>
-      </w:r>
-      <w:r>
-        <w:lastRenderedPageBreak/>
-        <w:t xml:space="preserve">is harmless, calling </w:t>
-      </w:r>
-      <w:proofErr w:type="gramStart"/>
-      <w:r>
-        <w:t>detach(</w:t>
-      </w:r>
-      <w:proofErr w:type="gramEnd"/>
-      <w:r>
-        <w:t>) on something not present is harmless, and neither can leave the list in an inconsistent state.</w:t>
-      </w:r>
-    </w:p>
-    <w:p/>
-    <w:p/>
-    <w:p>
-      <w:pPr>
-        <w:jc w:val="both"/>
-      </w:pPr>
-      <w:r>
-        <w:t>3.2)</w:t>
-      </w:r>
-    </w:p>
-    <w:p>
-      <w:pPr>
-        <w:jc w:val="both"/>
-      </w:pPr>
-      <w:r>
-        <w:t xml:space="preserve">Observer implementation and lifetime safety. Observer is a pure abstract base with one pure virtual method, </w:t>
-      </w:r>
-      <w:proofErr w:type="gramStart"/>
-      <w:r>
-        <w:t>update(</w:t>
-      </w:r>
-      <w:proofErr w:type="spellStart"/>
-      <w:proofErr w:type="gramEnd"/>
-      <w:r>
-        <w:t>const</w:t>
-      </w:r>
-      <w:proofErr w:type="spellEnd"/>
-      <w:r>
-        <w:t xml:space="preserve"> Notice&amp;), and a virtual destructor that does nothing itself (</w:t>
-      </w:r>
-      <w:proofErr w:type="gramStart"/>
-      <w:r>
-        <w:t>Observer::</w:t>
-      </w:r>
-      <w:proofErr w:type="gramEnd"/>
-      <w:r>
-        <w:t>~</w:t>
-      </w:r>
-      <w:proofErr w:type="gramStart"/>
-      <w:r>
-        <w:t>Observer(){</w:t>
-      </w:r>
-      <w:proofErr w:type="gramEnd"/>
-      <w:r>
-        <w:t>})</w:t>
-      </w:r>
-      <w:r>
-        <w:t>,</w:t>
-      </w:r>
-      <w:r>
-        <w:t xml:space="preserve"> it holds no state, so there's nothing for it to clean up on its own. </w:t>
-      </w:r>
-      <w:proofErr w:type="spellStart"/>
-      <w:r>
-        <w:t>EventUnit</w:t>
-      </w:r>
-      <w:proofErr w:type="spellEnd"/>
-      <w:r>
-        <w:t xml:space="preserve"> inherits from both </w:t>
-      </w:r>
-      <w:proofErr w:type="spellStart"/>
-      <w:r>
-        <w:t>EventComponent</w:t>
-      </w:r>
-      <w:proofErr w:type="spellEnd"/>
-      <w:r>
-        <w:t xml:space="preserve"> and Observer, giving every concrete leaf a dual role: Leaf in the Composite tree, and </w:t>
-      </w:r>
-      <w:proofErr w:type="spellStart"/>
-      <w:r>
-        <w:t>ConcreteObserver</w:t>
-      </w:r>
-      <w:proofErr w:type="spellEnd"/>
-      <w:r>
-        <w:t xml:space="preserve"> reacting to notices. </w:t>
-      </w:r>
-      <w:proofErr w:type="spellStart"/>
-      <w:proofErr w:type="gramStart"/>
-      <w:r>
-        <w:t>EventUnit</w:t>
-      </w:r>
-      <w:proofErr w:type="spellEnd"/>
-      <w:r>
-        <w:t>::update(</w:t>
-      </w:r>
-      <w:proofErr w:type="gramEnd"/>
-      <w:r>
-        <w:t>) stays pure virtual, forcing every concrete leaf (</w:t>
+        <w:t>update() stays pure virtual, forcing every concrete leaf (</w:t>
       </w:r>
       <w:proofErr w:type="spellStart"/>
       <w:r>
@@ -2058,7 +2074,7 @@
                     <pic:cNvPicPr/>
                   </pic:nvPicPr>
                   <pic:blipFill>
-                    <a:blip r:embed="rId17"/>
+                    <a:blip r:embed="rId18"/>
                     <a:stretch>
                       <a:fillRect/>
                     </a:stretch>
@@ -2085,11 +2101,12 @@
         </w:drawing>
       </w:r>
     </w:p>
-    <w:p/>
     <w:p>
       <w:r>
         <w:t xml:space="preserve">3.4 </w:t>
       </w:r>
+    </w:p>
+    <w:p>
       <w:r>
         <w:rPr>
           <w:noProof/>
@@ -2112,7 +2129,7 @@
                     </pic:cNvPicPr>
                   </pic:nvPicPr>
                   <pic:blipFill>
-                    <a:blip r:embed="rId18"/>
+                    <a:blip r:embed="rId19"/>
                     <a:stretch>
                       <a:fillRect/>
                     </a:stretch>
@@ -2174,7 +2191,7 @@
                     </pic:cNvPicPr>
                   </pic:nvPicPr>
                   <pic:blipFill>
-                    <a:blip r:embed="rId19"/>
+                    <a:blip r:embed="rId20"/>
                     <a:stretch>
                       <a:fillRect/>
                     </a:stretch>
@@ -2230,7 +2247,7 @@
                     <pic:cNvPicPr/>
                   </pic:nvPicPr>
                   <pic:blipFill>
-                    <a:blip r:embed="rId20"/>
+                    <a:blip r:embed="rId21"/>
                     <a:stretch>
                       <a:fillRect/>
                     </a:stretch>
@@ -2263,13 +2280,13 @@
           <w:noProof/>
         </w:rPr>
         <w:drawing>
-          <wp:anchor distT="0" distB="0" distL="114300" distR="114300" simplePos="0" relativeHeight="251681792" behindDoc="0" locked="0" layoutInCell="1" allowOverlap="1" wp14:anchorId="4D6FE54B" wp14:editId="51AE2B8A">
+          <wp:anchor distT="0" distB="0" distL="114300" distR="114300" simplePos="0" relativeHeight="251681792" behindDoc="0" locked="0" layoutInCell="1" allowOverlap="1" wp14:anchorId="4D6FE54B" wp14:editId="386F98A1">
             <wp:simplePos x="0" y="0"/>
             <wp:positionH relativeFrom="page">
-              <wp:posOffset>5017135</wp:posOffset>
+              <wp:posOffset>5931535</wp:posOffset>
             </wp:positionH>
             <wp:positionV relativeFrom="page">
-              <wp:posOffset>4778338</wp:posOffset>
+              <wp:posOffset>4796790</wp:posOffset>
             </wp:positionV>
             <wp:extent cx="1359535" cy="712470"/>
             <wp:effectExtent l="0" t="0" r="0" b="0"/>
@@ -2286,7 +2303,7 @@
                     <pic:cNvPicPr/>
                   </pic:nvPicPr>
                   <pic:blipFill>
-                    <a:blip r:embed="rId21"/>
+                    <a:blip r:embed="rId22"/>
                     <a:stretch>
                       <a:fillRect/>
                     </a:stretch>
@@ -2322,65 +2339,44 @@
         <w:t>We use push as</w:t>
       </w:r>
       <w:r>
-        <w:t xml:space="preserve"> </w:t>
+        <w:t xml:space="preserve"> notify() passes a full Notice straight into update(</w:t>
+      </w:r>
+      <w:proofErr w:type="spellStart"/>
+      <w:r>
+        <w:t>const</w:t>
+      </w:r>
+      <w:proofErr w:type="spellEnd"/>
+      <w:r>
+        <w:t xml:space="preserve"> Notice&amp;) observers never call back for more data.</w:t>
+      </w:r>
+    </w:p>
+    <w:p/>
+    <w:p>
+      <w:r>
+        <w:t>Trade-off. no stored current state</w:t>
+      </w:r>
+      <w:r>
+        <w:t>,</w:t>
+      </w:r>
+      <w:r>
+        <w:t xml:space="preserve"> no back-reference needed from observer to </w:t>
       </w:r>
       <w:proofErr w:type="gramStart"/>
       <w:r>
-        <w:t>notify(</w:t>
+        <w:t>subject</w:t>
       </w:r>
       <w:proofErr w:type="gramEnd"/>
       <w:r>
-        <w:t xml:space="preserve">) passes a full Notice straight into </w:t>
-      </w:r>
-      <w:proofErr w:type="gramStart"/>
-      <w:r>
-        <w:t>update(</w:t>
-      </w:r>
-      <w:proofErr w:type="spellStart"/>
-      <w:proofErr w:type="gramEnd"/>
-      <w:r>
-        <w:t>const</w:t>
-      </w:r>
-      <w:proofErr w:type="spellEnd"/>
-      <w:r>
-        <w:t xml:space="preserve"> Notice&amp;) observers never call back for more data.</w:t>
-      </w:r>
-    </w:p>
-    <w:p/>
-    <w:p>
-      <w:r>
-        <w:t>Trade-off. no stored current state</w:t>
+        <w:t xml:space="preserve"> and we don’t have to call many functions to figure out what the notice is about</w:t>
+      </w:r>
+      <w:r>
+        <w:t xml:space="preserve">. The cost is rigidity </w:t>
       </w:r>
       <w:r>
         <w:t>,</w:t>
       </w:r>
       <w:r>
-        <w:t xml:space="preserve"> no back-reference needed from observer to </w:t>
-      </w:r>
-      <w:proofErr w:type="gramStart"/>
-      <w:r>
-        <w:t>subject</w:t>
-      </w:r>
-      <w:proofErr w:type="gramEnd"/>
-      <w:r>
-        <w:t xml:space="preserve"> and we don’t have to call many functions to figure out what the notice is about</w:t>
-      </w:r>
-      <w:r>
-        <w:t xml:space="preserve">. The cost is </w:t>
-      </w:r>
-      <w:proofErr w:type="gramStart"/>
-      <w:r>
-        <w:t xml:space="preserve">rigidity </w:t>
-      </w:r>
-      <w:r>
-        <w:t>,</w:t>
-      </w:r>
-      <w:r>
-        <w:t>every</w:t>
-      </w:r>
-      <w:proofErr w:type="gramEnd"/>
-      <w:r>
-        <w:t xml:space="preserve"> notice type </w:t>
+        <w:t xml:space="preserve">every notice type </w:t>
       </w:r>
       <w:proofErr w:type="gramStart"/>
       <w:r>
@@ -2448,7 +2444,7 @@
                     <pic:cNvPicPr/>
                   </pic:nvPicPr>
                   <pic:blipFill>
-                    <a:blip r:embed="rId22"/>
+                    <a:blip r:embed="rId23"/>
                     <a:stretch>
                       <a:fillRect/>
                     </a:stretch>
@@ -2481,13 +2477,6 @@
           <w:lang w:val="en-US"/>
         </w:rPr>
       </w:pPr>
-    </w:p>
-    <w:p>
-      <w:pPr>
-        <w:rPr>
-          <w:lang w:val="en-US"/>
-        </w:rPr>
-      </w:pPr>
       <w:r>
         <w:rPr>
           <w:lang w:val="en-US"/>
@@ -2514,35 +2503,448 @@
         <w:rPr>
           <w:lang w:val="en-US"/>
         </w:rPr>
-        <w:t>::update(</w:t>
+        <w:t>::</w:t>
       </w:r>
       <w:proofErr w:type="gramEnd"/>
       <w:r>
         <w:rPr>
           <w:lang w:val="en-US"/>
         </w:rPr>
-        <w:t xml:space="preserve">) calls </w:t>
-      </w:r>
+        <w:t xml:space="preserve">update() calls close() on WEATHER_ALERT because it's an outdoor unit, with an explicit comment marking it as such. </w:t>
+      </w:r>
+      <w:proofErr w:type="spellStart"/>
       <w:proofErr w:type="gramStart"/>
       <w:r>
         <w:rPr>
           <w:lang w:val="en-US"/>
         </w:rPr>
-        <w:t>close(</w:t>
+        <w:t>PCStation</w:t>
+      </w:r>
+      <w:proofErr w:type="spellEnd"/>
+      <w:r>
+        <w:rPr>
+          <w:lang w:val="en-US"/>
+        </w:rPr>
+        <w:t>::</w:t>
       </w:r>
       <w:proofErr w:type="gramEnd"/>
       <w:r>
         <w:rPr>
           <w:lang w:val="en-US"/>
         </w:rPr>
-        <w:t xml:space="preserve">) on WEATHER_ALERT because it's an outdoor unit, with an explicit comment marking it as such. </w:t>
-      </w:r>
+        <w:t xml:space="preserve">update() has a WEATHER_ALERT case that does nothing (comment: // indoor unit), and </w:t>
+      </w:r>
+      <w:proofErr w:type="spellStart"/>
+      <w:r>
+        <w:rPr>
+          <w:lang w:val="en-US"/>
+        </w:rPr>
+        <w:t>ConsoleStation</w:t>
+      </w:r>
+      <w:proofErr w:type="spellEnd"/>
+      <w:r>
+        <w:rPr>
+          <w:lang w:val="en-US"/>
+        </w:rPr>
+        <w:t>/</w:t>
+      </w:r>
+      <w:proofErr w:type="spellStart"/>
+      <w:r>
+        <w:rPr>
+          <w:lang w:val="en-US"/>
+        </w:rPr>
+        <w:t>SwitchStation</w:t>
+      </w:r>
+      <w:proofErr w:type="spellEnd"/>
+      <w:r>
+        <w:rPr>
+          <w:lang w:val="en-US"/>
+        </w:rPr>
+        <w:t>/</w:t>
+      </w:r>
+      <w:proofErr w:type="spellStart"/>
+      <w:r>
+        <w:rPr>
+          <w:lang w:val="en-US"/>
+        </w:rPr>
+        <w:t>MerchVendor</w:t>
+      </w:r>
+      <w:proofErr w:type="spellEnd"/>
+      <w:r>
+        <w:rPr>
+          <w:lang w:val="en-US"/>
+        </w:rPr>
+        <w:t xml:space="preserve"> don't even list WEATHER_ALERT as a case, </w:t>
+      </w:r>
+      <w:r>
+        <w:rPr>
+          <w:lang w:val="en-US"/>
+        </w:rPr>
+        <w:lastRenderedPageBreak/>
+        <w:t xml:space="preserve">falling to default: break. </w:t>
+      </w:r>
+      <w:proofErr w:type="spellStart"/>
+      <w:r>
+        <w:rPr>
+          <w:lang w:val="en-US"/>
+        </w:rPr>
+        <w:t>MobileStation</w:t>
+      </w:r>
+      <w:proofErr w:type="spellEnd"/>
+      <w:r>
+        <w:rPr>
+          <w:lang w:val="en-US"/>
+        </w:rPr>
+        <w:t xml:space="preserve"> reacts a third way — clearing its queue but staying conceptually open, since it can physically relocate rather than shutting down. Same notice, three distinct polymorphic responses driven by what kind of unit each object is.</w:t>
+      </w:r>
+    </w:p>
+    <w:p>
+      <w:pPr>
+        <w:rPr>
+          <w:lang w:val="en-US"/>
+        </w:rPr>
+      </w:pPr>
+    </w:p>
+    <w:p>
+      <w:pPr>
+        <w:rPr>
+          <w:lang w:val="en-US"/>
+        </w:rPr>
+      </w:pPr>
+      <w:r>
+        <w:rPr>
+          <w:lang w:val="en-US"/>
+        </w:rPr>
+        <w:t>Rule 2: CAPACITY_ALERT produces suspension in some units, cosmetic logging in others, and silence elsewhere.</w:t>
+      </w:r>
+    </w:p>
+    <w:p>
+      <w:pPr>
+        <w:rPr>
+          <w:lang w:val="en-US"/>
+        </w:rPr>
+      </w:pPr>
+      <w:proofErr w:type="spellStart"/>
+      <w:r>
+        <w:rPr>
+          <w:lang w:val="en-US"/>
+        </w:rPr>
+        <w:t>TicketBooth</w:t>
+      </w:r>
+      <w:proofErr w:type="spellEnd"/>
+      <w:r>
+        <w:rPr>
+          <w:lang w:val="en-US"/>
+        </w:rPr>
+        <w:t xml:space="preserve"> stops selling (</w:t>
+      </w:r>
+      <w:proofErr w:type="spellStart"/>
+      <w:r>
+        <w:rPr>
+          <w:lang w:val="en-US"/>
+        </w:rPr>
+        <w:t>salesOpen</w:t>
+      </w:r>
+      <w:proofErr w:type="spellEnd"/>
+      <w:r>
+        <w:rPr>
+          <w:lang w:val="en-US"/>
+        </w:rPr>
+        <w:t xml:space="preserve"> = false), </w:t>
+      </w:r>
+      <w:proofErr w:type="spellStart"/>
+      <w:r>
+        <w:rPr>
+          <w:lang w:val="en-US"/>
+        </w:rPr>
+        <w:t>PCStation</w:t>
+      </w:r>
+      <w:proofErr w:type="spellEnd"/>
+      <w:r>
+        <w:rPr>
+          <w:lang w:val="en-US"/>
+        </w:rPr>
+        <w:t xml:space="preserve"> and </w:t>
+      </w:r>
+      <w:proofErr w:type="spellStart"/>
+      <w:r>
+        <w:rPr>
+          <w:lang w:val="en-US"/>
+        </w:rPr>
+        <w:t>VRBooth</w:t>
+      </w:r>
+      <w:proofErr w:type="spellEnd"/>
+      <w:r>
+        <w:rPr>
+          <w:lang w:val="en-US"/>
+        </w:rPr>
+        <w:t xml:space="preserve"> suspend/cooldown their sessions, </w:t>
+      </w:r>
+      <w:proofErr w:type="spellStart"/>
+      <w:r>
+        <w:rPr>
+          <w:lang w:val="en-US"/>
+        </w:rPr>
+        <w:t>ConsoleStation</w:t>
+      </w:r>
+      <w:proofErr w:type="spellEnd"/>
+      <w:r>
+        <w:rPr>
+          <w:lang w:val="en-US"/>
+        </w:rPr>
+        <w:t xml:space="preserve"> caps sign-ups (halving effective capacity), while </w:t>
+      </w:r>
+      <w:proofErr w:type="spellStart"/>
+      <w:r>
+        <w:rPr>
+          <w:lang w:val="en-US"/>
+        </w:rPr>
+        <w:t>MerchVendor</w:t>
+      </w:r>
+      <w:proofErr w:type="spellEnd"/>
+      <w:r>
+        <w:rPr>
+          <w:lang w:val="en-US"/>
+        </w:rPr>
+        <w:t xml:space="preserve"> only logs a "flagged for restock" message without changing any state, and </w:t>
+      </w:r>
+      <w:proofErr w:type="spellStart"/>
+      <w:r>
+        <w:rPr>
+          <w:lang w:val="en-US"/>
+        </w:rPr>
+        <w:t>SwitchStation</w:t>
+      </w:r>
+      <w:proofErr w:type="spellEnd"/>
+      <w:r>
+        <w:rPr>
+          <w:lang w:val="en-US"/>
+        </w:rPr>
+        <w:t>/</w:t>
+      </w:r>
+      <w:proofErr w:type="spellStart"/>
+      <w:r>
+        <w:rPr>
+          <w:lang w:val="en-US"/>
+        </w:rPr>
+        <w:t>FoodVendor</w:t>
+      </w:r>
+      <w:proofErr w:type="spellEnd"/>
+      <w:r>
+        <w:rPr>
+          <w:lang w:val="en-US"/>
+        </w:rPr>
+        <w:t>/</w:t>
+      </w:r>
+      <w:proofErr w:type="spellStart"/>
+      <w:r>
+        <w:rPr>
+          <w:lang w:val="en-US"/>
+        </w:rPr>
+        <w:t>TournamentDesk</w:t>
+      </w:r>
+      <w:proofErr w:type="spellEnd"/>
+      <w:r>
+        <w:rPr>
+          <w:lang w:val="en-US"/>
+        </w:rPr>
+        <w:t xml:space="preserve"> ignore it entirely.</w:t>
+      </w:r>
+    </w:p>
+    <w:p>
+      <w:pPr>
+        <w:rPr>
+          <w:lang w:val="en-US"/>
+        </w:rPr>
+      </w:pPr>
+    </w:p>
+    <w:p>
+      <w:pPr>
+        <w:rPr>
+          <w:lang w:val="en-US"/>
+        </w:rPr>
+      </w:pPr>
+      <w:r>
+        <w:rPr>
+          <w:lang w:val="en-US"/>
+        </w:rPr>
+        <w:t>Rule 3: EVACUATE triggers graceful shutdown with different "cleanup" semantics per unit.</w:t>
+      </w:r>
+    </w:p>
+    <w:p>
+      <w:pPr>
+        <w:rPr>
+          <w:lang w:val="en-US"/>
+        </w:rPr>
+      </w:pPr>
       <w:proofErr w:type="spellStart"/>
       <w:proofErr w:type="gramStart"/>
       <w:r>
         <w:rPr>
           <w:lang w:val="en-US"/>
         </w:rPr>
+        <w:t>ConsoleStation</w:t>
+      </w:r>
+      <w:proofErr w:type="spellEnd"/>
+      <w:r>
+        <w:rPr>
+          <w:lang w:val="en-US"/>
+        </w:rPr>
+        <w:t>::</w:t>
+      </w:r>
+      <w:proofErr w:type="gramEnd"/>
+      <w:r>
+        <w:rPr>
+          <w:lang w:val="en-US"/>
+        </w:rPr>
+        <w:t xml:space="preserve">close() saves active sessions before shutting down. </w:t>
+      </w:r>
+      <w:proofErr w:type="spellStart"/>
+      <w:proofErr w:type="gramStart"/>
+      <w:r>
+        <w:rPr>
+          <w:lang w:val="en-US"/>
+        </w:rPr>
+        <w:t>FoodVendor</w:t>
+      </w:r>
+      <w:proofErr w:type="spellEnd"/>
+      <w:r>
+        <w:rPr>
+          <w:lang w:val="en-US"/>
+        </w:rPr>
+        <w:t>::</w:t>
+      </w:r>
+      <w:proofErr w:type="gramEnd"/>
+      <w:r>
+        <w:rPr>
+          <w:lang w:val="en-US"/>
+        </w:rPr>
+        <w:t xml:space="preserve">close() finishes the current order first. </w:t>
+      </w:r>
+      <w:proofErr w:type="spellStart"/>
+      <w:r>
+        <w:rPr>
+          <w:lang w:val="en-US"/>
+        </w:rPr>
+        <w:t>TicketBooth</w:t>
+      </w:r>
+      <w:proofErr w:type="spellEnd"/>
+      <w:r>
+        <w:rPr>
+          <w:lang w:val="en-US"/>
+        </w:rPr>
+        <w:t xml:space="preserve"> doesn't just close — it sets </w:t>
+      </w:r>
+      <w:proofErr w:type="spellStart"/>
+      <w:r>
+        <w:rPr>
+          <w:lang w:val="en-US"/>
+        </w:rPr>
+        <w:t>lockedByEvacuation</w:t>
+      </w:r>
+      <w:proofErr w:type="spellEnd"/>
+      <w:r>
+        <w:rPr>
+          <w:lang w:val="en-US"/>
+        </w:rPr>
+        <w:t xml:space="preserve"> = true, meaning it will refuse to reopen even if open() is called again, until a RESUME notice clears the lock. </w:t>
+      </w:r>
+      <w:proofErr w:type="spellStart"/>
+      <w:r>
+        <w:rPr>
+          <w:lang w:val="en-US"/>
+        </w:rPr>
+        <w:t>VRBooth</w:t>
+      </w:r>
+      <w:proofErr w:type="spellEnd"/>
+      <w:r>
+        <w:rPr>
+          <w:lang w:val="en-US"/>
+        </w:rPr>
+        <w:t xml:space="preserve"> force-ends its session and enters cooldown. Same trigger, four different shutdown behaviors, each expressed through the object's own state and close() override rather than a shared branch.</w:t>
+      </w:r>
+    </w:p>
+    <w:p>
+      <w:pPr>
+        <w:rPr>
+          <w:lang w:val="en-US"/>
+        </w:rPr>
+      </w:pPr>
+    </w:p>
+    <w:p>
+      <w:pPr>
+        <w:rPr>
+          <w:lang w:val="en-US"/>
+        </w:rPr>
+      </w:pPr>
+      <w:r>
+        <w:rPr>
+          <w:lang w:val="en-US"/>
+        </w:rPr>
+        <w:t>Rule 4: RESUME doesn't just "undo" — it's asymmetric with what caused the suspension.</w:t>
+      </w:r>
+    </w:p>
+    <w:p>
+      <w:pPr>
+        <w:rPr>
+          <w:lang w:val="en-US"/>
+        </w:rPr>
+      </w:pPr>
+      <w:proofErr w:type="spellStart"/>
+      <w:proofErr w:type="gramStart"/>
+      <w:r>
+        <w:rPr>
+          <w:lang w:val="en-US"/>
+        </w:rPr>
+        <w:t>TicketBooth</w:t>
+      </w:r>
+      <w:proofErr w:type="spellEnd"/>
+      <w:r>
+        <w:rPr>
+          <w:lang w:val="en-US"/>
+        </w:rPr>
+        <w:t>::</w:t>
+      </w:r>
+      <w:proofErr w:type="gramEnd"/>
+      <w:r>
+        <w:rPr>
+          <w:lang w:val="en-US"/>
+        </w:rPr>
+        <w:t xml:space="preserve">update() on RESUME only clears </w:t>
+      </w:r>
+      <w:proofErr w:type="spellStart"/>
+      <w:r>
+        <w:rPr>
+          <w:lang w:val="en-US"/>
+        </w:rPr>
+        <w:t>lockedByEvacuation</w:t>
+      </w:r>
+      <w:proofErr w:type="spellEnd"/>
+      <w:r>
+        <w:rPr>
+          <w:lang w:val="en-US"/>
+        </w:rPr>
+        <w:t xml:space="preserve"> — it does not automatically reopen sales (</w:t>
+      </w:r>
+      <w:proofErr w:type="spellStart"/>
+      <w:r>
+        <w:rPr>
+          <w:lang w:val="en-US"/>
+        </w:rPr>
+        <w:t>salesOpen</w:t>
+      </w:r>
+      <w:proofErr w:type="spellEnd"/>
+      <w:r>
+        <w:rPr>
+          <w:lang w:val="en-US"/>
+        </w:rPr>
+        <w:t xml:space="preserve"> stays false until someone explicitly calls open()), reflecting that "cleared to resume" and "actually open" are different states. </w:t>
+      </w:r>
+      <w:proofErr w:type="spellStart"/>
+      <w:r>
+        <w:rPr>
+          <w:lang w:val="en-US"/>
+        </w:rPr>
         <w:t>PCStation</w:t>
       </w:r>
       <w:proofErr w:type="spellEnd"/>
@@ -2550,35 +2952,183 @@
         <w:rPr>
           <w:lang w:val="en-US"/>
         </w:rPr>
-        <w:t>::update(</w:t>
+        <w:t xml:space="preserve"> and </w:t>
+      </w:r>
+      <w:proofErr w:type="spellStart"/>
+      <w:r>
+        <w:rPr>
+          <w:lang w:val="en-US"/>
+        </w:rPr>
+        <w:t>VRBooth</w:t>
+      </w:r>
+      <w:proofErr w:type="spellEnd"/>
+      <w:r>
+        <w:rPr>
+          <w:lang w:val="en-US"/>
+        </w:rPr>
+        <w:t xml:space="preserve"> clear their suspension flags directly. </w:t>
+      </w:r>
+      <w:proofErr w:type="spellStart"/>
+      <w:r>
+        <w:rPr>
+          <w:lang w:val="en-US"/>
+        </w:rPr>
+        <w:t>TournamentDesk</w:t>
+      </w:r>
+      <w:proofErr w:type="spellEnd"/>
+      <w:r>
+        <w:rPr>
+          <w:lang w:val="en-US"/>
+        </w:rPr>
+        <w:t xml:space="preserve"> goes further and reopens immediately, printing which round resumes. </w:t>
+      </w:r>
+      <w:proofErr w:type="spellStart"/>
+      <w:r>
+        <w:rPr>
+          <w:lang w:val="en-US"/>
+        </w:rPr>
+        <w:t>ConsoleStation</w:t>
+      </w:r>
+      <w:proofErr w:type="spellEnd"/>
+      <w:r>
+        <w:rPr>
+          <w:lang w:val="en-US"/>
+        </w:rPr>
+        <w:t xml:space="preserve"> un-caps sign-ups. This shows RESUME isn't a single uniform "reverse everything" branch — each unit decides what resuming </w:t>
+      </w:r>
+      <w:proofErr w:type="gramStart"/>
+      <w:r>
+        <w:rPr>
+          <w:lang w:val="en-US"/>
+        </w:rPr>
+        <w:t>actually means</w:t>
       </w:r>
       <w:proofErr w:type="gramEnd"/>
       <w:r>
         <w:rPr>
           <w:lang w:val="en-US"/>
         </w:rPr>
-        <w:t xml:space="preserve">) has a </w:t>
+        <w:t xml:space="preserve"> for it.</w:t>
+      </w:r>
+    </w:p>
+    <w:p>
+      <w:pPr>
+        <w:rPr>
+          <w:lang w:val="en-US"/>
+        </w:rPr>
+      </w:pPr>
+    </w:p>
+    <w:p>
+      <w:pPr>
+        <w:rPr>
+          <w:lang w:val="en-US"/>
+        </w:rPr>
+      </w:pPr>
+      <w:r>
+        <w:rPr>
+          <w:lang w:val="en-US"/>
+        </w:rPr>
+        <w:t>Rule 5: SCHEDULE_CHANGE affects queue-based units differently from fixed-session units.</w:t>
+      </w:r>
+    </w:p>
+    <w:p>
+      <w:pPr>
+        <w:rPr>
+          <w:lang w:val="en-US"/>
+        </w:rPr>
+      </w:pPr>
+      <w:proofErr w:type="spellStart"/>
+      <w:proofErr w:type="gramStart"/>
+      <w:r>
+        <w:rPr>
+          <w:lang w:val="en-US"/>
+        </w:rPr>
+        <w:t>MobileStation</w:t>
+      </w:r>
+      <w:proofErr w:type="spellEnd"/>
+      <w:r>
+        <w:rPr>
+          <w:lang w:val="en-US"/>
+        </w:rPr>
+        <w:t>::</w:t>
+      </w:r>
+      <w:proofErr w:type="gramEnd"/>
+      <w:r>
+        <w:rPr>
+          <w:lang w:val="en-US"/>
+        </w:rPr>
+        <w:t>update() redirects part of its queue (min(</w:t>
+      </w:r>
+      <w:proofErr w:type="spellStart"/>
+      <w:r>
+        <w:rPr>
+          <w:lang w:val="en-US"/>
+        </w:rPr>
+        <w:t>queueLength</w:t>
+      </w:r>
+      <w:proofErr w:type="spellEnd"/>
+      <w:r>
+        <w:rPr>
+          <w:lang w:val="en-US"/>
+        </w:rPr>
+        <w:t xml:space="preserve">, </w:t>
+      </w:r>
+      <w:proofErr w:type="spellStart"/>
+      <w:r>
+        <w:rPr>
+          <w:lang w:val="en-US"/>
+        </w:rPr>
+        <w:t>notice.value</w:t>
+      </w:r>
+      <w:proofErr w:type="spellEnd"/>
+      <w:r>
+        <w:rPr>
+          <w:lang w:val="en-US"/>
+        </w:rPr>
+        <w:t xml:space="preserve">)), using the notice's numeric value field meaningfully. </w:t>
+      </w:r>
+      <w:proofErr w:type="spellStart"/>
+      <w:proofErr w:type="gramStart"/>
+      <w:r>
+        <w:rPr>
+          <w:lang w:val="en-US"/>
+        </w:rPr>
+        <w:t>TournamentDesk</w:t>
+      </w:r>
+      <w:proofErr w:type="spellEnd"/>
+      <w:r>
+        <w:rPr>
+          <w:lang w:val="en-US"/>
+        </w:rPr>
+        <w:t>::</w:t>
+      </w:r>
+      <w:proofErr w:type="gramEnd"/>
+      <w:r>
+        <w:rPr>
+          <w:lang w:val="en-US"/>
+        </w:rPr>
+        <w:t xml:space="preserve">update() closes </w:t>
       </w:r>
       <w:r>
         <w:rPr>
           <w:lang w:val="en-US"/>
         </w:rPr>
         <w:lastRenderedPageBreak/>
-        <w:t xml:space="preserve">WEATHER_ALERT case that does nothing (comment: // indoor unit), and </w:t>
-      </w:r>
-      <w:proofErr w:type="spellStart"/>
-      <w:r>
-        <w:rPr>
-          <w:lang w:val="en-US"/>
-        </w:rPr>
-        <w:t>ConsoleStation</w:t>
-      </w:r>
-      <w:proofErr w:type="spellEnd"/>
-      <w:r>
-        <w:rPr>
-          <w:lang w:val="en-US"/>
-        </w:rPr>
-        <w:t>/</w:t>
+        <w:t xml:space="preserve">the desk entirely for rescheduling. </w:t>
+      </w:r>
+      <w:proofErr w:type="spellStart"/>
+      <w:r>
+        <w:rPr>
+          <w:lang w:val="en-US"/>
+        </w:rPr>
+        <w:t>InfoDesk</w:t>
+      </w:r>
+      <w:proofErr w:type="spellEnd"/>
+      <w:r>
+        <w:rPr>
+          <w:lang w:val="en-US"/>
+        </w:rPr>
+        <w:t xml:space="preserve"> just updates its announcement board text. Units like </w:t>
       </w:r>
       <w:proofErr w:type="spellStart"/>
       <w:r>
@@ -2592,7 +3142,21 @@
         <w:rPr>
           <w:lang w:val="en-US"/>
         </w:rPr>
-        <w:t>/</w:t>
+        <w:t xml:space="preserve">, </w:t>
+      </w:r>
+      <w:proofErr w:type="spellStart"/>
+      <w:r>
+        <w:rPr>
+          <w:lang w:val="en-US"/>
+        </w:rPr>
+        <w:t>FoodVendor</w:t>
+      </w:r>
+      <w:proofErr w:type="spellEnd"/>
+      <w:r>
+        <w:rPr>
+          <w:lang w:val="en-US"/>
+        </w:rPr>
+        <w:t xml:space="preserve">, and </w:t>
       </w:r>
       <w:proofErr w:type="spellStart"/>
       <w:r>
@@ -2606,752 +3170,91 @@
         <w:rPr>
           <w:lang w:val="en-US"/>
         </w:rPr>
-        <w:t xml:space="preserve"> don't even list WEATHER_ALERT as a case, falling to default: break. </w:t>
-      </w:r>
-      <w:proofErr w:type="spellStart"/>
-      <w:r>
-        <w:rPr>
-          <w:lang w:val="en-US"/>
-        </w:rPr>
-        <w:t>MobileStation</w:t>
-      </w:r>
-      <w:proofErr w:type="spellEnd"/>
-      <w:r>
-        <w:rPr>
-          <w:lang w:val="en-US"/>
-        </w:rPr>
-        <w:t xml:space="preserve"> reacts a third way — clearing its queue but staying conceptually open, since it can physically relocate rather than shutting down. Same notice, three distinct polymorphic responses driven by what kind of unit each object is.</w:t>
-      </w:r>
-    </w:p>
-    <w:p>
-      <w:pPr>
-        <w:rPr>
-          <w:lang w:val="en-US"/>
-        </w:rPr>
-      </w:pPr>
-    </w:p>
-    <w:p>
-      <w:pPr>
-        <w:rPr>
-          <w:lang w:val="en-US"/>
-        </w:rPr>
-      </w:pPr>
-      <w:r>
-        <w:rPr>
-          <w:lang w:val="en-US"/>
-        </w:rPr>
-        <w:t>Rule 2: CAPACITY_ALERT produces suspension in some units, cosmetic logging in others, and silence elsewhere.</w:t>
-      </w:r>
-    </w:p>
-    <w:p>
-      <w:pPr>
-        <w:rPr>
-          <w:lang w:val="en-US"/>
-        </w:rPr>
-      </w:pPr>
-      <w:proofErr w:type="spellStart"/>
-      <w:r>
-        <w:rPr>
-          <w:lang w:val="en-US"/>
-        </w:rPr>
-        <w:t>TicketBooth</w:t>
-      </w:r>
-      <w:proofErr w:type="spellEnd"/>
-      <w:r>
-        <w:rPr>
-          <w:lang w:val="en-US"/>
-        </w:rPr>
-        <w:t xml:space="preserve"> stops selling (</w:t>
-      </w:r>
-      <w:proofErr w:type="spellStart"/>
-      <w:r>
-        <w:rPr>
-          <w:lang w:val="en-US"/>
-        </w:rPr>
-        <w:t>salesOpen</w:t>
-      </w:r>
-      <w:proofErr w:type="spellEnd"/>
-      <w:r>
-        <w:rPr>
-          <w:lang w:val="en-US"/>
-        </w:rPr>
-        <w:t xml:space="preserve"> = false), </w:t>
-      </w:r>
-      <w:proofErr w:type="spellStart"/>
-      <w:r>
-        <w:rPr>
-          <w:lang w:val="en-US"/>
-        </w:rPr>
-        <w:t>PCStation</w:t>
-      </w:r>
-      <w:proofErr w:type="spellEnd"/>
-      <w:r>
-        <w:rPr>
-          <w:lang w:val="en-US"/>
-        </w:rPr>
-        <w:t xml:space="preserve"> and </w:t>
-      </w:r>
-      <w:proofErr w:type="spellStart"/>
-      <w:r>
-        <w:rPr>
-          <w:lang w:val="en-US"/>
-        </w:rPr>
-        <w:t>VRBooth</w:t>
-      </w:r>
-      <w:proofErr w:type="spellEnd"/>
-      <w:r>
-        <w:rPr>
-          <w:lang w:val="en-US"/>
-        </w:rPr>
-        <w:t xml:space="preserve"> suspend/cooldown their sessions, </w:t>
-      </w:r>
-      <w:proofErr w:type="spellStart"/>
-      <w:r>
-        <w:rPr>
-          <w:lang w:val="en-US"/>
-        </w:rPr>
-        <w:t>ConsoleStation</w:t>
-      </w:r>
-      <w:proofErr w:type="spellEnd"/>
-      <w:r>
-        <w:rPr>
-          <w:lang w:val="en-US"/>
-        </w:rPr>
-        <w:t xml:space="preserve"> caps sign-ups (halving effective capacity), while </w:t>
-      </w:r>
-      <w:proofErr w:type="spellStart"/>
-      <w:r>
-        <w:rPr>
-          <w:lang w:val="en-US"/>
-        </w:rPr>
-        <w:t>MerchVendor</w:t>
-      </w:r>
-      <w:proofErr w:type="spellEnd"/>
-      <w:r>
-        <w:rPr>
-          <w:lang w:val="en-US"/>
-        </w:rPr>
-        <w:t xml:space="preserve"> only logs a "flagged for restock" message without changing any state, and </w:t>
-      </w:r>
-      <w:proofErr w:type="spellStart"/>
-      <w:r>
-        <w:rPr>
-          <w:lang w:val="en-US"/>
-        </w:rPr>
-        <w:t>SwitchStation</w:t>
-      </w:r>
-      <w:proofErr w:type="spellEnd"/>
-      <w:r>
-        <w:rPr>
-          <w:lang w:val="en-US"/>
-        </w:rPr>
-        <w:t>/</w:t>
-      </w:r>
-      <w:proofErr w:type="spellStart"/>
-      <w:r>
-        <w:rPr>
-          <w:lang w:val="en-US"/>
-        </w:rPr>
-        <w:t>FoodVendor</w:t>
-      </w:r>
-      <w:proofErr w:type="spellEnd"/>
-      <w:r>
-        <w:rPr>
-          <w:lang w:val="en-US"/>
-        </w:rPr>
-        <w:t>/</w:t>
-      </w:r>
-      <w:proofErr w:type="spellStart"/>
-      <w:r>
-        <w:rPr>
-          <w:lang w:val="en-US"/>
-        </w:rPr>
-        <w:t>TournamentDesk</w:t>
-      </w:r>
-      <w:proofErr w:type="spellEnd"/>
-      <w:r>
-        <w:rPr>
-          <w:lang w:val="en-US"/>
-        </w:rPr>
-        <w:t xml:space="preserve"> ignore it entirely.</w:t>
-      </w:r>
-    </w:p>
-    <w:p>
-      <w:pPr>
-        <w:rPr>
-          <w:lang w:val="en-US"/>
-        </w:rPr>
-      </w:pPr>
-    </w:p>
-    <w:p>
-      <w:pPr>
-        <w:rPr>
-          <w:lang w:val="en-US"/>
-        </w:rPr>
-      </w:pPr>
-      <w:r>
-        <w:rPr>
-          <w:lang w:val="en-US"/>
-        </w:rPr>
-        <w:t>Rule 3: EVACUATE triggers graceful shutdown with different "cleanup" semantics per unit.</w:t>
-      </w:r>
-    </w:p>
-    <w:p>
-      <w:pPr>
-        <w:rPr>
-          <w:lang w:val="en-US"/>
-        </w:rPr>
-      </w:pPr>
-      <w:proofErr w:type="spellStart"/>
+        <w:t xml:space="preserve"> don't react at all (no case for </w:t>
+      </w:r>
       <w:proofErr w:type="gramStart"/>
       <w:r>
         <w:rPr>
           <w:lang w:val="en-US"/>
         </w:rPr>
-        <w:t>ConsoleStation</w:t>
-      </w:r>
-      <w:proofErr w:type="spellEnd"/>
-      <w:r>
-        <w:rPr>
-          <w:lang w:val="en-US"/>
-        </w:rPr>
-        <w:t>::close(</w:t>
+        <w:t>it) —</w:t>
       </w:r>
       <w:proofErr w:type="gramEnd"/>
       <w:r>
         <w:rPr>
           <w:lang w:val="en-US"/>
         </w:rPr>
-        <w:t xml:space="preserve">) saves active sessions before shutting down. </w:t>
-      </w:r>
-      <w:proofErr w:type="spellStart"/>
+        <w:t xml:space="preserve"> showing the same notice type produces a spectrum from "hard close" to "text-only update" to "no reaction," entirely through each leaf's own update() override.</w:t>
+      </w:r>
+    </w:p>
+    <w:p>
+      <w:pPr>
+        <w:rPr>
+          <w:lang w:val="en-US"/>
+        </w:rPr>
+      </w:pPr>
+    </w:p>
+    <w:p>
+      <w:pPr>
+        <w:rPr>
+          <w:lang w:val="en-US"/>
+        </w:rPr>
+      </w:pPr>
+      <w:r>
+        <w:rPr>
+          <w:lang w:val="en-US"/>
+        </w:rPr>
+        <w:t>All five are achieved purely through each concrete leaf's own state and its override of update</w:t>
+      </w:r>
       <w:proofErr w:type="gramStart"/>
       <w:r>
         <w:rPr>
           <w:lang w:val="en-US"/>
         </w:rPr>
-        <w:t>FoodVendor</w:t>
-      </w:r>
-      <w:proofErr w:type="spellEnd"/>
-      <w:r>
-        <w:rPr>
-          <w:lang w:val="en-US"/>
-        </w:rPr>
-        <w:t>::close(</w:t>
+        <w:t>() —</w:t>
       </w:r>
       <w:proofErr w:type="gramEnd"/>
       <w:r>
         <w:rPr>
           <w:lang w:val="en-US"/>
         </w:rPr>
-        <w:t xml:space="preserve">) finishes the current order first. </w:t>
-      </w:r>
-      <w:proofErr w:type="spellStart"/>
-      <w:r>
-        <w:rPr>
-          <w:lang w:val="en-US"/>
-        </w:rPr>
-        <w:t>TicketBooth</w:t>
-      </w:r>
-      <w:proofErr w:type="spellEnd"/>
-      <w:r>
-        <w:rPr>
-          <w:lang w:val="en-US"/>
-        </w:rPr>
-        <w:t xml:space="preserve"> doesn't just close — it sets </w:t>
-      </w:r>
-      <w:proofErr w:type="spellStart"/>
-      <w:r>
-        <w:rPr>
-          <w:lang w:val="en-US"/>
-        </w:rPr>
-        <w:t>lockedByEvacuation</w:t>
-      </w:r>
-      <w:proofErr w:type="spellEnd"/>
-      <w:r>
-        <w:rPr>
-          <w:lang w:val="en-US"/>
-        </w:rPr>
-        <w:t xml:space="preserve"> = true, meaning it will refuse to reopen even if </w:t>
-      </w:r>
+        <w:t xml:space="preserve"> there's no central if (</w:t>
+      </w:r>
+      <w:proofErr w:type="spellStart"/>
+      <w:r>
+        <w:rPr>
+          <w:lang w:val="en-US"/>
+        </w:rPr>
+        <w:t>typeid</w:t>
+      </w:r>
+      <w:proofErr w:type="spellEnd"/>
+      <w:r>
+        <w:rPr>
+          <w:lang w:val="en-US"/>
+        </w:rPr>
+        <w:t xml:space="preserve">(x) == ...) dispatch anywhere; </w:t>
+      </w:r>
+      <w:proofErr w:type="spellStart"/>
       <w:proofErr w:type="gramStart"/>
       <w:r>
         <w:rPr>
           <w:lang w:val="en-US"/>
         </w:rPr>
-        <w:t>open(</w:t>
+        <w:t>EventGroup</w:t>
+      </w:r>
+      <w:proofErr w:type="spellEnd"/>
+      <w:r>
+        <w:rPr>
+          <w:lang w:val="en-US"/>
+        </w:rPr>
+        <w:t>::</w:t>
       </w:r>
       <w:proofErr w:type="gramEnd"/>
       <w:r>
         <w:rPr>
           <w:lang w:val="en-US"/>
         </w:rPr>
-        <w:t xml:space="preserve">) is called again, until a RESUME notice clears the lock. </w:t>
-      </w:r>
-      <w:proofErr w:type="spellStart"/>
-      <w:r>
-        <w:rPr>
-          <w:lang w:val="en-US"/>
-        </w:rPr>
-        <w:t>VRBooth</w:t>
-      </w:r>
-      <w:proofErr w:type="spellEnd"/>
-      <w:r>
-        <w:rPr>
-          <w:lang w:val="en-US"/>
-        </w:rPr>
-        <w:t xml:space="preserve"> force-ends its session and enters cooldown. Same trigger, four different shutdown behaviors, each expressed through the object's own state and </w:t>
-      </w:r>
-      <w:proofErr w:type="gramStart"/>
-      <w:r>
-        <w:rPr>
-          <w:lang w:val="en-US"/>
-        </w:rPr>
-        <w:t>close(</w:t>
-      </w:r>
-      <w:proofErr w:type="gramEnd"/>
-      <w:r>
-        <w:rPr>
-          <w:lang w:val="en-US"/>
-        </w:rPr>
-        <w:t>) override rather than a shared branch.</w:t>
-      </w:r>
-    </w:p>
-    <w:p>
-      <w:pPr>
-        <w:rPr>
-          <w:lang w:val="en-US"/>
-        </w:rPr>
-      </w:pPr>
-    </w:p>
-    <w:p>
-      <w:pPr>
-        <w:rPr>
-          <w:lang w:val="en-US"/>
-        </w:rPr>
-      </w:pPr>
-      <w:r>
-        <w:rPr>
-          <w:lang w:val="en-US"/>
-        </w:rPr>
-        <w:t>Rule 4: RESUME doesn't just "undo" — it's asymmetric with what caused the suspension.</w:t>
-      </w:r>
-    </w:p>
-    <w:p>
-      <w:pPr>
-        <w:rPr>
-          <w:lang w:val="en-US"/>
-        </w:rPr>
-      </w:pPr>
-      <w:proofErr w:type="spellStart"/>
-      <w:proofErr w:type="gramStart"/>
-      <w:r>
-        <w:rPr>
-          <w:lang w:val="en-US"/>
-        </w:rPr>
-        <w:t>TicketBooth</w:t>
-      </w:r>
-      <w:proofErr w:type="spellEnd"/>
-      <w:r>
-        <w:rPr>
-          <w:lang w:val="en-US"/>
-        </w:rPr>
-        <w:t>::update(</w:t>
-      </w:r>
-      <w:proofErr w:type="gramEnd"/>
-      <w:r>
-        <w:rPr>
-          <w:lang w:val="en-US"/>
-        </w:rPr>
-        <w:t xml:space="preserve">) on RESUME only clears </w:t>
-      </w:r>
-      <w:proofErr w:type="spellStart"/>
-      <w:r>
-        <w:rPr>
-          <w:lang w:val="en-US"/>
-        </w:rPr>
-        <w:t>lockedByEvacuation</w:t>
-      </w:r>
-      <w:proofErr w:type="spellEnd"/>
-      <w:r>
-        <w:rPr>
-          <w:lang w:val="en-US"/>
-        </w:rPr>
-        <w:t xml:space="preserve"> — it does not automatically reopen sales (</w:t>
-      </w:r>
-      <w:proofErr w:type="spellStart"/>
-      <w:r>
-        <w:rPr>
-          <w:lang w:val="en-US"/>
-        </w:rPr>
-        <w:t>salesOpen</w:t>
-      </w:r>
-      <w:proofErr w:type="spellEnd"/>
-      <w:r>
-        <w:rPr>
-          <w:lang w:val="en-US"/>
-        </w:rPr>
-        <w:t xml:space="preserve"> stays false until someone explicitly calls </w:t>
-      </w:r>
-      <w:proofErr w:type="gramStart"/>
-      <w:r>
-        <w:rPr>
-          <w:lang w:val="en-US"/>
-        </w:rPr>
-        <w:t>open(</w:t>
-      </w:r>
-      <w:proofErr w:type="gramEnd"/>
-      <w:r>
-        <w:rPr>
-          <w:lang w:val="en-US"/>
-        </w:rPr>
-        <w:t xml:space="preserve">)), reflecting that "cleared to resume" and "actually open" are different states. </w:t>
-      </w:r>
-      <w:proofErr w:type="spellStart"/>
-      <w:r>
-        <w:rPr>
-          <w:lang w:val="en-US"/>
-        </w:rPr>
-        <w:t>PCStation</w:t>
-      </w:r>
-      <w:proofErr w:type="spellEnd"/>
-      <w:r>
-        <w:rPr>
-          <w:lang w:val="en-US"/>
-        </w:rPr>
-        <w:t xml:space="preserve"> and </w:t>
-      </w:r>
-      <w:proofErr w:type="spellStart"/>
-      <w:r>
-        <w:rPr>
-          <w:lang w:val="en-US"/>
-        </w:rPr>
-        <w:t>VRBooth</w:t>
-      </w:r>
-      <w:proofErr w:type="spellEnd"/>
-      <w:r>
-        <w:rPr>
-          <w:lang w:val="en-US"/>
-        </w:rPr>
-        <w:t xml:space="preserve"> clear their suspension flags directly. </w:t>
-      </w:r>
-      <w:proofErr w:type="spellStart"/>
-      <w:r>
-        <w:rPr>
-          <w:lang w:val="en-US"/>
-        </w:rPr>
-        <w:t>TournamentDesk</w:t>
-      </w:r>
-      <w:proofErr w:type="spellEnd"/>
-      <w:r>
-        <w:rPr>
-          <w:lang w:val="en-US"/>
-        </w:rPr>
-        <w:t xml:space="preserve"> goes further and reopens immediately, printing which round resumes. </w:t>
-      </w:r>
-      <w:proofErr w:type="spellStart"/>
-      <w:r>
-        <w:rPr>
-          <w:lang w:val="en-US"/>
-        </w:rPr>
-        <w:t>ConsoleStation</w:t>
-      </w:r>
-      <w:proofErr w:type="spellEnd"/>
-      <w:r>
-        <w:rPr>
-          <w:lang w:val="en-US"/>
-        </w:rPr>
-        <w:t xml:space="preserve"> un-caps sign-ups. This shows RESUME isn't a single uniform "reverse everything" branch — each unit decides what resuming </w:t>
-      </w:r>
-      <w:proofErr w:type="gramStart"/>
-      <w:r>
-        <w:rPr>
-          <w:lang w:val="en-US"/>
-        </w:rPr>
-        <w:t>actually means</w:t>
-      </w:r>
-      <w:proofErr w:type="gramEnd"/>
-      <w:r>
-        <w:rPr>
-          <w:lang w:val="en-US"/>
-        </w:rPr>
-        <w:t xml:space="preserve"> for it.</w:t>
-      </w:r>
-    </w:p>
-    <w:p>
-      <w:pPr>
-        <w:rPr>
-          <w:lang w:val="en-US"/>
-        </w:rPr>
-      </w:pPr>
-    </w:p>
-    <w:p>
-      <w:pPr>
-        <w:rPr>
-          <w:lang w:val="en-US"/>
-        </w:rPr>
-      </w:pPr>
-      <w:r>
-        <w:rPr>
-          <w:lang w:val="en-US"/>
-        </w:rPr>
-        <w:t>Rule 5: SCHEDULE_CHANGE affects queue-based units differently from fixed-session units.</w:t>
-      </w:r>
-    </w:p>
-    <w:p>
-      <w:pPr>
-        <w:rPr>
-          <w:lang w:val="en-US"/>
-        </w:rPr>
-      </w:pPr>
-      <w:proofErr w:type="spellStart"/>
-      <w:proofErr w:type="gramStart"/>
-      <w:r>
-        <w:rPr>
-          <w:lang w:val="en-US"/>
-        </w:rPr>
-        <w:lastRenderedPageBreak/>
-        <w:t>MobileStation</w:t>
-      </w:r>
-      <w:proofErr w:type="spellEnd"/>
-      <w:r>
-        <w:rPr>
-          <w:lang w:val="en-US"/>
-        </w:rPr>
-        <w:t>::update(</w:t>
-      </w:r>
-      <w:proofErr w:type="gramEnd"/>
-      <w:r>
-        <w:rPr>
-          <w:lang w:val="en-US"/>
-        </w:rPr>
-        <w:t>) redirects part of its queue (</w:t>
-      </w:r>
-      <w:proofErr w:type="gramStart"/>
-      <w:r>
-        <w:rPr>
-          <w:lang w:val="en-US"/>
-        </w:rPr>
-        <w:t>min(</w:t>
-      </w:r>
-      <w:proofErr w:type="spellStart"/>
-      <w:proofErr w:type="gramEnd"/>
-      <w:r>
-        <w:rPr>
-          <w:lang w:val="en-US"/>
-        </w:rPr>
-        <w:t>queueLength</w:t>
-      </w:r>
-      <w:proofErr w:type="spellEnd"/>
-      <w:r>
-        <w:rPr>
-          <w:lang w:val="en-US"/>
-        </w:rPr>
-        <w:t xml:space="preserve">, </w:t>
-      </w:r>
-      <w:proofErr w:type="spellStart"/>
-      <w:r>
-        <w:rPr>
-          <w:lang w:val="en-US"/>
-        </w:rPr>
-        <w:t>notice.value</w:t>
-      </w:r>
-      <w:proofErr w:type="spellEnd"/>
-      <w:r>
-        <w:rPr>
-          <w:lang w:val="en-US"/>
-        </w:rPr>
-        <w:t xml:space="preserve">)), using the notice's numeric value field meaningfully. </w:t>
-      </w:r>
-      <w:proofErr w:type="spellStart"/>
-      <w:proofErr w:type="gramStart"/>
-      <w:r>
-        <w:rPr>
-          <w:lang w:val="en-US"/>
-        </w:rPr>
-        <w:t>TournamentDesk</w:t>
-      </w:r>
-      <w:proofErr w:type="spellEnd"/>
-      <w:r>
-        <w:rPr>
-          <w:lang w:val="en-US"/>
-        </w:rPr>
-        <w:t>::update(</w:t>
-      </w:r>
-      <w:proofErr w:type="gramEnd"/>
-      <w:r>
-        <w:rPr>
-          <w:lang w:val="en-US"/>
-        </w:rPr>
-        <w:t xml:space="preserve">) closes the desk entirely for rescheduling. </w:t>
-      </w:r>
-      <w:proofErr w:type="spellStart"/>
-      <w:r>
-        <w:rPr>
-          <w:lang w:val="en-US"/>
-        </w:rPr>
-        <w:t>InfoDesk</w:t>
-      </w:r>
-      <w:proofErr w:type="spellEnd"/>
-      <w:r>
-        <w:rPr>
-          <w:lang w:val="en-US"/>
-        </w:rPr>
-        <w:t xml:space="preserve"> just updates its announcement board text. Units like </w:t>
-      </w:r>
-      <w:proofErr w:type="spellStart"/>
-      <w:r>
-        <w:rPr>
-          <w:lang w:val="en-US"/>
-        </w:rPr>
-        <w:t>SwitchStation</w:t>
-      </w:r>
-      <w:proofErr w:type="spellEnd"/>
-      <w:r>
-        <w:rPr>
-          <w:lang w:val="en-US"/>
-        </w:rPr>
-        <w:t xml:space="preserve">, </w:t>
-      </w:r>
-      <w:proofErr w:type="spellStart"/>
-      <w:r>
-        <w:rPr>
-          <w:lang w:val="en-US"/>
-        </w:rPr>
-        <w:t>FoodVendor</w:t>
-      </w:r>
-      <w:proofErr w:type="spellEnd"/>
-      <w:r>
-        <w:rPr>
-          <w:lang w:val="en-US"/>
-        </w:rPr>
-        <w:t xml:space="preserve">, and </w:t>
-      </w:r>
-      <w:proofErr w:type="spellStart"/>
-      <w:r>
-        <w:rPr>
-          <w:lang w:val="en-US"/>
-        </w:rPr>
-        <w:t>MerchVendor</w:t>
-      </w:r>
-      <w:proofErr w:type="spellEnd"/>
-      <w:r>
-        <w:rPr>
-          <w:lang w:val="en-US"/>
-        </w:rPr>
-        <w:t xml:space="preserve"> don't react at all (no case for </w:t>
-      </w:r>
-      <w:proofErr w:type="gramStart"/>
-      <w:r>
-        <w:rPr>
-          <w:lang w:val="en-US"/>
-        </w:rPr>
-        <w:t>it) —</w:t>
-      </w:r>
-      <w:proofErr w:type="gramEnd"/>
-      <w:r>
-        <w:rPr>
-          <w:lang w:val="en-US"/>
-        </w:rPr>
-        <w:t xml:space="preserve"> showing the same notice type produces a spectrum from "hard close" to "text-only update" to "no reaction," entirely through each leaf's own </w:t>
-      </w:r>
-      <w:proofErr w:type="gramStart"/>
-      <w:r>
-        <w:rPr>
-          <w:lang w:val="en-US"/>
-        </w:rPr>
-        <w:t>update(</w:t>
-      </w:r>
-      <w:proofErr w:type="gramEnd"/>
-      <w:r>
-        <w:rPr>
-          <w:lang w:val="en-US"/>
-        </w:rPr>
-        <w:t>) override.</w:t>
-      </w:r>
-    </w:p>
-    <w:p>
-      <w:pPr>
-        <w:rPr>
-          <w:lang w:val="en-US"/>
-        </w:rPr>
-      </w:pPr>
-    </w:p>
-    <w:p>
-      <w:pPr>
-        <w:rPr>
-          <w:lang w:val="en-US"/>
-        </w:rPr>
-      </w:pPr>
-      <w:r>
-        <w:rPr>
-          <w:lang w:val="en-US"/>
-        </w:rPr>
-        <w:t xml:space="preserve">All five are achieved purely through each concrete leaf's own state and its override of </w:t>
-      </w:r>
-      <w:proofErr w:type="gramStart"/>
-      <w:r>
-        <w:rPr>
-          <w:lang w:val="en-US"/>
-        </w:rPr>
-        <w:t>update(</w:t>
-      </w:r>
-      <w:proofErr w:type="gramEnd"/>
-      <w:r>
-        <w:rPr>
-          <w:lang w:val="en-US"/>
-        </w:rPr>
-        <w:t>) — there's no central if (</w:t>
-      </w:r>
-      <w:proofErr w:type="spellStart"/>
-      <w:r>
-        <w:rPr>
-          <w:lang w:val="en-US"/>
-        </w:rPr>
-        <w:t>typeid</w:t>
-      </w:r>
-      <w:proofErr w:type="spellEnd"/>
-      <w:r>
-        <w:rPr>
-          <w:lang w:val="en-US"/>
-        </w:rPr>
-        <w:t xml:space="preserve">(x) == ...) dispatch anywhere; </w:t>
-      </w:r>
-      <w:proofErr w:type="spellStart"/>
-      <w:proofErr w:type="gramStart"/>
-      <w:r>
-        <w:rPr>
-          <w:lang w:val="en-US"/>
-        </w:rPr>
-        <w:t>EventGroup</w:t>
-      </w:r>
-      <w:proofErr w:type="spellEnd"/>
-      <w:r>
-        <w:rPr>
-          <w:lang w:val="en-US"/>
-        </w:rPr>
-        <w:t>::update(</w:t>
-      </w:r>
-      <w:proofErr w:type="gramEnd"/>
-      <w:r>
-        <w:rPr>
-          <w:lang w:val="en-US"/>
-        </w:rPr>
-        <w:t xml:space="preserve">) just cascades the notice via </w:t>
-      </w:r>
-      <w:proofErr w:type="gramStart"/>
-      <w:r>
-        <w:rPr>
-          <w:lang w:val="en-US"/>
-        </w:rPr>
-        <w:t>notify(</w:t>
-      </w:r>
-      <w:proofErr w:type="gramEnd"/>
-      <w:r>
-        <w:rPr>
-          <w:lang w:val="en-US"/>
-        </w:rPr>
-        <w:t>), and each leaf decides its own reaction.</w:t>
+        <w:t>update() just cascades the notice via notify(), and each leaf decides its own reaction.</w:t>
       </w:r>
     </w:p>
     <w:p>
@@ -3366,16 +3269,16 @@
           <w:lang w:val="en-US"/>
         </w:rPr>
         <w:drawing>
-          <wp:anchor distT="0" distB="0" distL="114300" distR="114300" simplePos="0" relativeHeight="251710464" behindDoc="0" locked="0" layoutInCell="1" allowOverlap="1" wp14:anchorId="07133F61" wp14:editId="01990AF7">
+          <wp:anchor distT="0" distB="0" distL="114300" distR="114300" simplePos="0" relativeHeight="251710464" behindDoc="0" locked="0" layoutInCell="1" allowOverlap="1" wp14:anchorId="07133F61" wp14:editId="1664C3E6">
             <wp:simplePos x="0" y="0"/>
             <wp:positionH relativeFrom="margin">
-              <wp:posOffset>-195131</wp:posOffset>
+              <wp:posOffset>-10160</wp:posOffset>
             </wp:positionH>
             <wp:positionV relativeFrom="page">
-              <wp:posOffset>3799392</wp:posOffset>
+              <wp:posOffset>3456940</wp:posOffset>
             </wp:positionV>
-            <wp:extent cx="5731510" cy="383540"/>
-            <wp:effectExtent l="0" t="0" r="2540" b="0"/>
+            <wp:extent cx="6405245" cy="428625"/>
+            <wp:effectExtent l="0" t="0" r="0" b="9525"/>
             <wp:wrapSquare wrapText="bothSides"/>
             <wp:docPr id="1769349011" name="Picture 1"/>
             <wp:cNvGraphicFramePr>
@@ -3389,7 +3292,7 @@
                     <pic:cNvPicPr/>
                   </pic:nvPicPr>
                   <pic:blipFill>
-                    <a:blip r:embed="rId23"/>
+                    <a:blip r:embed="rId24"/>
                     <a:stretch>
                       <a:fillRect/>
                     </a:stretch>
@@ -3397,7 +3300,7 @@
                   <pic:spPr>
                     <a:xfrm>
                       <a:off x="0" y="0"/>
-                      <a:ext cx="5731510" cy="383540"/>
+                      <a:ext cx="6405245" cy="428625"/>
                     </a:xfrm>
                     <a:prstGeom prst="rect">
                       <a:avLst/>
@@ -3406,6 +3309,12 @@
                 </pic:pic>
               </a:graphicData>
             </a:graphic>
+            <wp14:sizeRelH relativeFrom="margin">
+              <wp14:pctWidth>0</wp14:pctWidth>
+            </wp14:sizeRelH>
+            <wp14:sizeRelV relativeFrom="margin">
+              <wp14:pctHeight>0</wp14:pctHeight>
+            </wp14:sizeRelV>
           </wp:anchor>
         </w:drawing>
       </w:r>
@@ -3503,27 +3412,182 @@
         <w:rPr>
           <w:lang w:val="en-US"/>
         </w:rPr>
-        <w:t>open(</w:t>
+        <w:t>open</w:t>
       </w:r>
       <w:proofErr w:type="gramEnd"/>
       <w:r>
         <w:rPr>
           <w:lang w:val="en-US"/>
         </w:rPr>
-        <w:t xml:space="preserve">) calls entirely until explicitly cleared by RESUME, and a cooling-down VR booth refuses new sessions until RESUME arrives too. This adds a believable "can't immediately snap back to normal" behavior without any single class growing new responsibilities — each leaf just tracks one private bool and checks it in </w:t>
-      </w:r>
+        <w:t>() calls entirely until explicitly cleared by RESUME, and a cooling-down VR booth refuses new sessions until RESUME arrives too. This adds a believable "can't immediately snap back to normal" behavior without any single class growing new responsibilities — each leaf just tracks one private bool and checks it in open().</w:t>
+      </w:r>
+    </w:p>
+    <w:p>
+      <w:pPr>
+        <w:rPr>
+          <w:lang w:val="en-US"/>
+        </w:rPr>
+      </w:pPr>
+    </w:p>
+    <w:p>
+      <w:pPr>
+        <w:rPr>
+          <w:lang w:val="en-US"/>
+        </w:rPr>
+      </w:pPr>
+      <w:r>
+        <w:rPr>
+          <w:lang w:val="en-US"/>
+        </w:rPr>
+        <w:t>Feature 2: Stock-based capacity semantics (</w:t>
+      </w:r>
+      <w:proofErr w:type="spellStart"/>
+      <w:r>
+        <w:rPr>
+          <w:lang w:val="en-US"/>
+        </w:rPr>
+        <w:t>MerchVendor</w:t>
+      </w:r>
+      <w:proofErr w:type="spellEnd"/>
+      <w:r>
+        <w:rPr>
+          <w:lang w:val="en-US"/>
+        </w:rPr>
+        <w:t>).</w:t>
+      </w:r>
+    </w:p>
+    <w:p>
+      <w:pPr>
+        <w:rPr>
+          <w:lang w:val="en-US"/>
+        </w:rPr>
+      </w:pPr>
+      <w:r>
+        <w:rPr>
+          <w:lang w:val="en-US"/>
+        </w:rPr>
+        <w:t xml:space="preserve">Rather than every leaf's </w:t>
+      </w:r>
+      <w:proofErr w:type="spellStart"/>
+      <w:r>
+        <w:rPr>
+          <w:lang w:val="en-US"/>
+        </w:rPr>
+        <w:t>getCapacity</w:t>
+      </w:r>
+      <w:proofErr w:type="spellEnd"/>
+      <w:r>
+        <w:rPr>
+          <w:lang w:val="en-US"/>
+        </w:rPr>
+        <w:t xml:space="preserve">() meaning "seats/headcount," </w:t>
+      </w:r>
+      <w:proofErr w:type="spellStart"/>
       <w:proofErr w:type="gramStart"/>
       <w:r>
         <w:rPr>
           <w:lang w:val="en-US"/>
         </w:rPr>
-        <w:t>open(</w:t>
-      </w:r>
+        <w:t>MerchVendor</w:t>
+      </w:r>
+      <w:proofErr w:type="spellEnd"/>
+      <w:r>
+        <w:rPr>
+          <w:lang w:val="en-US"/>
+        </w:rPr>
+        <w:t>::</w:t>
+      </w:r>
+      <w:proofErr w:type="spellStart"/>
       <w:proofErr w:type="gramEnd"/>
       <w:r>
         <w:rPr>
           <w:lang w:val="en-US"/>
         </w:rPr>
+        <w:t>getCapacity</w:t>
+      </w:r>
+      <w:proofErr w:type="spellEnd"/>
+      <w:r>
+        <w:rPr>
+          <w:lang w:val="en-US"/>
+        </w:rPr>
+        <w:t xml:space="preserve">() deliberately repurposes the same virtual interface to mean "remaining stock," with sell()/restock() operations that never let stock go negative. This shows the common </w:t>
+      </w:r>
+      <w:proofErr w:type="spellStart"/>
+      <w:r>
+        <w:rPr>
+          <w:lang w:val="en-US"/>
+        </w:rPr>
+        <w:t>EventComponent</w:t>
+      </w:r>
+      <w:proofErr w:type="spellEnd"/>
+      <w:r>
+        <w:rPr>
+          <w:lang w:val="en-US"/>
+        </w:rPr>
+        <w:t xml:space="preserve"> interface can carry different real-world meaning per leaf while still aggregating sensibly through </w:t>
+      </w:r>
+      <w:proofErr w:type="spellStart"/>
+      <w:proofErr w:type="gramStart"/>
+      <w:r>
+        <w:rPr>
+          <w:lang w:val="en-US"/>
+        </w:rPr>
+        <w:t>EventGroup</w:t>
+      </w:r>
+      <w:proofErr w:type="spellEnd"/>
+      <w:r>
+        <w:rPr>
+          <w:lang w:val="en-US"/>
+        </w:rPr>
+        <w:t>::</w:t>
+      </w:r>
+      <w:proofErr w:type="spellStart"/>
+      <w:proofErr w:type="gramEnd"/>
+      <w:r>
+        <w:rPr>
+          <w:lang w:val="en-US"/>
+        </w:rPr>
+        <w:t>getCapacity</w:t>
+      </w:r>
+      <w:proofErr w:type="spellEnd"/>
+      <w:r>
+        <w:rPr>
+          <w:lang w:val="en-US"/>
+        </w:rPr>
+        <w:t>()'s summation — no changes needed anywhere else in the tree.</w:t>
+      </w:r>
+    </w:p>
+    <w:p>
+      <w:pPr>
+        <w:rPr>
+          <w:lang w:val="en-US"/>
+        </w:rPr>
+      </w:pPr>
+    </w:p>
+    <w:p>
+      <w:pPr>
+        <w:rPr>
+          <w:lang w:val="en-US"/>
+        </w:rPr>
+      </w:pPr>
+      <w:r>
+        <w:rPr>
+          <w:lang w:val="en-US"/>
+        </w:rPr>
+        <w:t>Feature 3: Order-in-progress tracking (</w:t>
+      </w:r>
+      <w:proofErr w:type="spellStart"/>
+      <w:r>
+        <w:rPr>
+          <w:lang w:val="en-US"/>
+        </w:rPr>
+        <w:t>FoodVendor</w:t>
+      </w:r>
+      <w:proofErr w:type="spellEnd"/>
+      <w:r>
+        <w:rPr>
+          <w:lang w:val="en-US"/>
+        </w:rPr>
         <w:t>).</w:t>
       </w:r>
     </w:p>
@@ -3533,230 +3597,27 @@
           <w:lang w:val="en-US"/>
         </w:rPr>
       </w:pPr>
-    </w:p>
-    <w:p>
-      <w:pPr>
-        <w:rPr>
-          <w:lang w:val="en-US"/>
-        </w:rPr>
-      </w:pPr>
-      <w:r>
-        <w:rPr>
-          <w:lang w:val="en-US"/>
-        </w:rPr>
-        <w:t>Feature 2: Stock-based capacity semantics (</w:t>
-      </w:r>
-      <w:proofErr w:type="spellStart"/>
-      <w:r>
-        <w:rPr>
-          <w:lang w:val="en-US"/>
-        </w:rPr>
-        <w:t>MerchVendor</w:t>
-      </w:r>
-      <w:proofErr w:type="spellEnd"/>
-      <w:r>
-        <w:rPr>
-          <w:lang w:val="en-US"/>
-        </w:rPr>
-        <w:t>).</w:t>
-      </w:r>
-    </w:p>
-    <w:p>
-      <w:pPr>
-        <w:rPr>
-          <w:lang w:val="en-US"/>
-        </w:rPr>
-      </w:pPr>
-      <w:r>
-        <w:rPr>
-          <w:lang w:val="en-US"/>
-        </w:rPr>
-        <w:t xml:space="preserve">Rather than every leaf's </w:t>
-      </w:r>
       <w:proofErr w:type="spellStart"/>
       <w:proofErr w:type="gramStart"/>
       <w:r>
         <w:rPr>
           <w:lang w:val="en-US"/>
         </w:rPr>
-        <w:t>getCapacity</w:t>
-      </w:r>
-      <w:proofErr w:type="spellEnd"/>
-      <w:r>
-        <w:rPr>
-          <w:lang w:val="en-US"/>
-        </w:rPr>
-        <w:t>(</w:t>
-      </w:r>
+        <w:t>FoodVendor</w:t>
+      </w:r>
+      <w:proofErr w:type="spellEnd"/>
+      <w:r>
+        <w:rPr>
+          <w:lang w:val="en-US"/>
+        </w:rPr>
+        <w:t>::</w:t>
+      </w:r>
+      <w:proofErr w:type="spellStart"/>
       <w:proofErr w:type="gramEnd"/>
       <w:r>
         <w:rPr>
           <w:lang w:val="en-US"/>
         </w:rPr>
-        <w:t xml:space="preserve">) meaning "seats/headcount," </w:t>
-      </w:r>
-      <w:proofErr w:type="spellStart"/>
-      <w:proofErr w:type="gramStart"/>
-      <w:r>
-        <w:rPr>
-          <w:lang w:val="en-US"/>
-        </w:rPr>
-        <w:t>MerchVendor</w:t>
-      </w:r>
-      <w:proofErr w:type="spellEnd"/>
-      <w:r>
-        <w:rPr>
-          <w:lang w:val="en-US"/>
-        </w:rPr>
-        <w:t>::</w:t>
-      </w:r>
-      <w:proofErr w:type="spellStart"/>
-      <w:r>
-        <w:rPr>
-          <w:lang w:val="en-US"/>
-        </w:rPr>
-        <w:t>getCapacity</w:t>
-      </w:r>
-      <w:proofErr w:type="spellEnd"/>
-      <w:r>
-        <w:rPr>
-          <w:lang w:val="en-US"/>
-        </w:rPr>
-        <w:t>(</w:t>
-      </w:r>
-      <w:proofErr w:type="gramEnd"/>
-      <w:r>
-        <w:rPr>
-          <w:lang w:val="en-US"/>
-        </w:rPr>
-        <w:t>) deliberately repurposes the same virtual interface to mean "remaining stock," with sell()/</w:t>
-      </w:r>
-      <w:proofErr w:type="gramStart"/>
-      <w:r>
-        <w:rPr>
-          <w:lang w:val="en-US"/>
-        </w:rPr>
-        <w:t>restock(</w:t>
-      </w:r>
-      <w:proofErr w:type="gramEnd"/>
-      <w:r>
-        <w:rPr>
-          <w:lang w:val="en-US"/>
-        </w:rPr>
-        <w:t xml:space="preserve">) operations that never let stock go negative. This shows the common </w:t>
-      </w:r>
-      <w:proofErr w:type="spellStart"/>
-      <w:r>
-        <w:rPr>
-          <w:lang w:val="en-US"/>
-        </w:rPr>
-        <w:t>EventComponent</w:t>
-      </w:r>
-      <w:proofErr w:type="spellEnd"/>
-      <w:r>
-        <w:rPr>
-          <w:lang w:val="en-US"/>
-        </w:rPr>
-        <w:t xml:space="preserve"> interface can carry different real-world meaning per leaf while still aggregating sensibly through </w:t>
-      </w:r>
-      <w:proofErr w:type="spellStart"/>
-      <w:proofErr w:type="gramStart"/>
-      <w:r>
-        <w:rPr>
-          <w:lang w:val="en-US"/>
-        </w:rPr>
-        <w:t>EventGroup</w:t>
-      </w:r>
-      <w:proofErr w:type="spellEnd"/>
-      <w:r>
-        <w:rPr>
-          <w:lang w:val="en-US"/>
-        </w:rPr>
-        <w:t>::</w:t>
-      </w:r>
-      <w:proofErr w:type="spellStart"/>
-      <w:r>
-        <w:rPr>
-          <w:lang w:val="en-US"/>
-        </w:rPr>
-        <w:t>getCapacity</w:t>
-      </w:r>
-      <w:proofErr w:type="spellEnd"/>
-      <w:r>
-        <w:rPr>
-          <w:lang w:val="en-US"/>
-        </w:rPr>
-        <w:t>(</w:t>
-      </w:r>
-      <w:proofErr w:type="gramEnd"/>
-      <w:r>
-        <w:rPr>
-          <w:lang w:val="en-US"/>
-        </w:rPr>
-        <w:t>)'s summation — no changes needed anywhere else in the tree.</w:t>
-      </w:r>
-    </w:p>
-    <w:p>
-      <w:pPr>
-        <w:rPr>
-          <w:lang w:val="en-US"/>
-        </w:rPr>
-      </w:pPr>
-    </w:p>
-    <w:p>
-      <w:pPr>
-        <w:rPr>
-          <w:lang w:val="en-US"/>
-        </w:rPr>
-      </w:pPr>
-      <w:r>
-        <w:rPr>
-          <w:lang w:val="en-US"/>
-        </w:rPr>
-        <w:t>Feature 3: Order-in-progress tracking (</w:t>
-      </w:r>
-      <w:proofErr w:type="spellStart"/>
-      <w:r>
-        <w:rPr>
-          <w:lang w:val="en-US"/>
-        </w:rPr>
-        <w:t>FoodVendor</w:t>
-      </w:r>
-      <w:proofErr w:type="spellEnd"/>
-      <w:r>
-        <w:rPr>
-          <w:lang w:val="en-US"/>
-        </w:rPr>
-        <w:t>).</w:t>
-      </w:r>
-    </w:p>
-    <w:p>
-      <w:pPr>
-        <w:rPr>
-          <w:lang w:val="en-US"/>
-        </w:rPr>
-      </w:pPr>
-      <w:proofErr w:type="spellStart"/>
-      <w:proofErr w:type="gramStart"/>
-      <w:r>
-        <w:rPr>
-          <w:lang w:val="en-US"/>
-        </w:rPr>
-        <w:t>FoodVendor</w:t>
-      </w:r>
-      <w:proofErr w:type="spellEnd"/>
-      <w:r>
-        <w:rPr>
-          <w:lang w:val="en-US"/>
-        </w:rPr>
-        <w:t>::</w:t>
-      </w:r>
-      <w:proofErr w:type="spellStart"/>
-      <w:proofErr w:type="gramEnd"/>
-      <w:r>
-        <w:rPr>
-          <w:lang w:val="en-US"/>
-        </w:rPr>
         <w:t>beginOrder</w:t>
       </w:r>
       <w:proofErr w:type="spellEnd"/>
@@ -3767,7 +3628,6 @@
         <w:t>()/</w:t>
       </w:r>
       <w:proofErr w:type="spellStart"/>
-      <w:proofErr w:type="gramStart"/>
       <w:r>
         <w:rPr>
           <w:lang w:val="en-US"/>
@@ -3779,28 +3639,7 @@
         <w:rPr>
           <w:lang w:val="en-US"/>
         </w:rPr>
-        <w:t>(</w:t>
-      </w:r>
-      <w:proofErr w:type="gramEnd"/>
-      <w:r>
-        <w:rPr>
-          <w:lang w:val="en-US"/>
-        </w:rPr>
-        <w:t xml:space="preserve">) track whether a customer transaction is mid-flight, and </w:t>
-      </w:r>
-      <w:proofErr w:type="gramStart"/>
-      <w:r>
-        <w:rPr>
-          <w:lang w:val="en-US"/>
-        </w:rPr>
-        <w:t>close(</w:t>
-      </w:r>
-      <w:proofErr w:type="gramEnd"/>
-      <w:r>
-        <w:rPr>
-          <w:lang w:val="en-US"/>
-        </w:rPr>
-        <w:t xml:space="preserve">) checks this before shutting down, printing a "finishing current order before closing" message rather than cutting off service instantly. This is a small but genuine behavioral difference from </w:t>
+        <w:t xml:space="preserve">() track whether a customer transaction is mid-flight, and close() checks this before shutting down, printing a "finishing current order before closing" message rather than cutting off service instantly. This is a small but genuine behavioral difference from </w:t>
       </w:r>
       <w:proofErr w:type="spellStart"/>
       <w:r>
@@ -3914,7 +3753,7 @@
                     <pic:cNvPicPr/>
                   </pic:nvPicPr>
                   <pic:blipFill>
-                    <a:blip r:embed="rId24"/>
+                    <a:blip r:embed="rId25"/>
                     <a:stretch>
                       <a:fillRect/>
                     </a:stretch>
@@ -3963,7 +3802,7 @@
                     <pic:cNvPicPr/>
                   </pic:nvPicPr>
                   <pic:blipFill>
-                    <a:blip r:embed="rId25"/>
+                    <a:blip r:embed="rId26"/>
                     <a:stretch>
                       <a:fillRect/>
                     </a:stretch>
@@ -4026,7 +3865,7 @@
                     <pic:cNvPicPr/>
                   </pic:nvPicPr>
                   <pic:blipFill>
-                    <a:blip r:embed="rId26"/>
+                    <a:blip r:embed="rId27"/>
                     <a:stretch>
                       <a:fillRect/>
                     </a:stretch>
@@ -4075,7 +3914,7 @@
                     <pic:cNvPicPr/>
                   </pic:nvPicPr>
                   <pic:blipFill>
-                    <a:blip r:embed="rId27"/>
+                    <a:blip r:embed="rId28"/>
                     <a:stretch>
                       <a:fillRect/>
                     </a:stretch>
@@ -4146,7 +3985,7 @@
                     <pic:cNvPicPr/>
                   </pic:nvPicPr>
                   <pic:blipFill>
-                    <a:blip r:embed="rId28"/>
+                    <a:blip r:embed="rId29"/>
                     <a:stretch>
                       <a:fillRect/>
                     </a:stretch>
@@ -4195,7 +4034,7 @@
                     <pic:cNvPicPr/>
                   </pic:nvPicPr>
                   <pic:blipFill>
-                    <a:blip r:embed="rId29"/>
+                    <a:blip r:embed="rId30"/>
                     <a:stretch>
                       <a:fillRect/>
                     </a:stretch>
@@ -4245,7 +4084,7 @@
                     <pic:cNvPicPr/>
                   </pic:nvPicPr>
                   <pic:blipFill>
-                    <a:blip r:embed="rId30"/>
+                    <a:blip r:embed="rId31"/>
                     <a:stretch>
                       <a:fillRect/>
                     </a:stretch>
@@ -4294,7 +4133,7 @@
                     <pic:cNvPicPr/>
                   </pic:nvPicPr>
                   <pic:blipFill>
-                    <a:blip r:embed="rId31"/>
+                    <a:blip r:embed="rId32"/>
                     <a:stretch>
                       <a:fillRect/>
                     </a:stretch>
@@ -4368,7 +4207,7 @@
                     <pic:cNvPicPr/>
                   </pic:nvPicPr>
                   <pic:blipFill>
-                    <a:blip r:embed="rId32"/>
+                    <a:blip r:embed="rId33"/>
                     <a:stretch>
                       <a:fillRect/>
                     </a:stretch>
@@ -4427,7 +4266,7 @@
                     <pic:cNvPicPr/>
                   </pic:nvPicPr>
                   <pic:blipFill>
-                    <a:blip r:embed="rId33"/>
+                    <a:blip r:embed="rId34"/>
                     <a:stretch>
                       <a:fillRect/>
                     </a:stretch>
@@ -4486,7 +4325,7 @@
                     <pic:cNvPicPr/>
                   </pic:nvPicPr>
                   <pic:blipFill>
-                    <a:blip r:embed="rId34"/>
+                    <a:blip r:embed="rId35"/>
                     <a:stretch>
                       <a:fillRect/>
                     </a:stretch>
@@ -4512,7 +4351,7 @@
           </wp:anchor>
         </w:drawing>
       </w:r>
-      <w:hyperlink r:id="rId35" w:history="1">
+      <w:hyperlink r:id="rId36" w:history="1">
         <w:r>
           <w:rPr>
             <w:rStyle w:val="Hyperlink"/>
@@ -4539,17 +4378,23 @@
     <w:p>
       <w:pPr>
         <w:rPr>
-          <w:lang w:val="en-US"/>
-        </w:rPr>
-      </w:pPr>
-      <w:r>
-        <w:rPr>
+          <w:b/>
+          <w:bCs/>
+          <w:lang w:val="en-US"/>
+        </w:rPr>
+      </w:pPr>
+      <w:r>
+        <w:rPr>
+          <w:b/>
+          <w:bCs/>
           <w:lang w:val="en-US"/>
         </w:rPr>
         <w:t>Kyle</w:t>
       </w:r>
       <w:r>
         <w:rPr>
+          <w:b/>
+          <w:bCs/>
           <w:lang w:val="en-US"/>
         </w:rPr>
         <w:t xml:space="preserve"> completed:</w:t>
@@ -4615,23 +4460,78 @@
         <w:rPr>
           <w:lang w:val="en-US"/>
         </w:rPr>
-        <w:t>, fixed 2.4</w:t>
-      </w:r>
-      <w:r>
-        <w:rPr>
-          <w:lang w:val="en-US"/>
-        </w:rPr>
-        <w:t>, added 3.1, 3.2</w:t>
-      </w:r>
-    </w:p>
-    <w:p>
-      <w:pPr>
-        <w:rPr>
-          <w:lang w:val="en-US"/>
-        </w:rPr>
-      </w:pPr>
-      <w:r>
-        <w:rPr>
+        <w:t xml:space="preserve">, </w:t>
+      </w:r>
+    </w:p>
+    <w:p>
+      <w:pPr>
+        <w:rPr>
+          <w:lang w:val="en-US"/>
+        </w:rPr>
+      </w:pPr>
+      <w:r>
+        <w:rPr>
+          <w:lang w:val="en-US"/>
+        </w:rPr>
+        <w:t>4. F</w:t>
+      </w:r>
+      <w:r>
+        <w:rPr>
+          <w:lang w:val="en-US"/>
+        </w:rPr>
+        <w:t>ixed 2.4</w:t>
+      </w:r>
+    </w:p>
+    <w:p>
+      <w:pPr>
+        <w:rPr>
+          <w:lang w:val="en-US"/>
+        </w:rPr>
+      </w:pPr>
+      <w:r>
+        <w:rPr>
+          <w:lang w:val="en-US"/>
+        </w:rPr>
+        <w:t>5. A</w:t>
+      </w:r>
+      <w:r>
+        <w:rPr>
+          <w:lang w:val="en-US"/>
+        </w:rPr>
+        <w:t xml:space="preserve">nswered </w:t>
+      </w:r>
+      <w:r>
+        <w:rPr>
+          <w:lang w:val="en-US"/>
+        </w:rPr>
+        <w:t>3.1, 3.2</w:t>
+      </w:r>
+      <w:r>
+        <w:rPr>
+          <w:lang w:val="en-US"/>
+        </w:rPr>
+        <w:t xml:space="preserve"> theory questions</w:t>
+      </w:r>
+    </w:p>
+    <w:p>
+      <w:pPr>
+        <w:rPr>
+          <w:lang w:val="en-US"/>
+        </w:rPr>
+      </w:pPr>
+    </w:p>
+    <w:p>
+      <w:pPr>
+        <w:rPr>
+          <w:b/>
+          <w:bCs/>
+          <w:lang w:val="en-US"/>
+        </w:rPr>
+      </w:pPr>
+      <w:r>
+        <w:rPr>
+          <w:b/>
+          <w:bCs/>
           <w:lang w:val="en-US"/>
         </w:rPr>
         <w:t>Takunda completed:</w:t>
@@ -4688,8 +4588,19 @@
           <w:lang w:val="en-US"/>
         </w:rPr>
       </w:pPr>
-      <w:r>
-        <w:rPr>
+    </w:p>
+    <w:p>
+      <w:pPr>
+        <w:rPr>
+          <w:b/>
+          <w:bCs/>
+          <w:lang w:val="en-US"/>
+        </w:rPr>
+      </w:pPr>
+      <w:r>
+        <w:rPr>
+          <w:b/>
+          <w:bCs/>
           <w:lang w:val="en-US"/>
         </w:rPr>
         <w:t>Brett completed:</w:t>
@@ -4744,18 +4655,49 @@
         </w:rPr>
         <w:t xml:space="preserve"> Completed Object diagram</w:t>
       </w:r>
-    </w:p>
-    <w:p>
-      <w:pPr>
-        <w:rPr>
-          <w:lang w:val="en-US"/>
-        </w:rPr>
-      </w:pPr>
-      <w:r>
-        <w:rPr>
-          <w:lang w:val="en-US"/>
-        </w:rPr>
-        <w:t>3.</w:t>
+      <w:r>
+        <w:rPr>
+          <w:lang w:val="en-US"/>
+        </w:rPr>
+        <w:t xml:space="preserve"> (2.3)</w:t>
+      </w:r>
+    </w:p>
+    <w:p>
+      <w:pPr>
+        <w:rPr>
+          <w:lang w:val="en-US"/>
+        </w:rPr>
+      </w:pPr>
+      <w:r>
+        <w:rPr>
+          <w:lang w:val="en-US"/>
+        </w:rPr>
+        <w:t>3. Coded all but lower 5 leaves</w:t>
+      </w:r>
+      <w:r>
+        <w:rPr>
+          <w:lang w:val="en-US"/>
+        </w:rPr>
+        <w:t>(event units)</w:t>
+      </w:r>
+    </w:p>
+    <w:p>
+      <w:pPr>
+        <w:rPr>
+          <w:lang w:val="en-US"/>
+        </w:rPr>
+      </w:pPr>
+      <w:r>
+        <w:rPr>
+          <w:lang w:val="en-US"/>
+        </w:rPr>
+        <w:t>4</w:t>
+      </w:r>
+      <w:r>
+        <w:rPr>
+          <w:lang w:val="en-US"/>
+        </w:rPr>
+        <w:t>.</w:t>
       </w:r>
       <w:r>
         <w:rPr>
@@ -4776,6 +4718,71 @@
           <w:lang w:val="en-US"/>
         </w:rPr>
       </w:pPr>
+      <w:r>
+        <w:rPr>
+          <w:lang w:val="en-US"/>
+        </w:rPr>
+        <w:t>5. Setup PDF</w:t>
+      </w:r>
+    </w:p>
+    <w:p>
+      <w:pPr>
+        <w:rPr>
+          <w:lang w:val="en-US"/>
+        </w:rPr>
+      </w:pPr>
+    </w:p>
+    <w:p>
+      <w:pPr>
+        <w:rPr>
+          <w:lang w:val="en-US"/>
+        </w:rPr>
+      </w:pPr>
+    </w:p>
+    <w:p>
+      <w:pPr>
+        <w:rPr>
+          <w:lang w:val="en-US"/>
+        </w:rPr>
+      </w:pPr>
+    </w:p>
+    <w:p>
+      <w:pPr>
+        <w:rPr>
+          <w:lang w:val="en-US"/>
+        </w:rPr>
+      </w:pPr>
+    </w:p>
+    <w:p>
+      <w:pPr>
+        <w:rPr>
+          <w:lang w:val="en-US"/>
+        </w:rPr>
+      </w:pPr>
+    </w:p>
+    <w:p>
+      <w:pPr>
+        <w:rPr>
+          <w:lang w:val="en-US"/>
+        </w:rPr>
+      </w:pPr>
+    </w:p>
+    <w:p>
+      <w:pPr>
+        <w:rPr>
+          <w:b/>
+          <w:bCs/>
+          <w:lang w:val="en-US"/>
+        </w:rPr>
+      </w:pPr>
+      <w:r>
+        <w:rPr>
+          <w:b/>
+          <w:bCs/>
+          <w:lang w:val="en-US"/>
+        </w:rPr>
+        <w:t>How work was done:</w:t>
+      </w:r>
     </w:p>
     <w:p>
       <w:pPr>
@@ -4868,7 +4875,6 @@
         <w:rPr>
           <w:lang w:val="en-US"/>
         </w:rPr>
-        <w:lastRenderedPageBreak/>
         <w:t xml:space="preserve">Three commits that show this in practice: Brett's "Merge pull request #7 from KP23545756/feature/first5leaves+makefile" followed shortly by "Fixed errors and </w:t>
       </w:r>
       <w:proofErr w:type="spellStart"/>
@@ -4941,53 +4947,15 @@
     <w:p>
       <w:pPr>
         <w:rPr>
-          <w:lang w:val="en-US"/>
-        </w:rPr>
-      </w:pPr>
-    </w:p>
-    <w:p>
-      <w:pPr>
-        <w:rPr>
-          <w:lang w:val="en-US"/>
-        </w:rPr>
-      </w:pPr>
-    </w:p>
-    <w:p>
-      <w:pPr>
-        <w:rPr>
-          <w:lang w:val="en-US"/>
-        </w:rPr>
-      </w:pPr>
-    </w:p>
-    <w:p>
-      <w:pPr>
-        <w:rPr>
-          <w:lang w:val="en-US"/>
-        </w:rPr>
-      </w:pPr>
-    </w:p>
-    <w:p>
-      <w:pPr>
-        <w:rPr>
-          <w:lang w:val="en-US"/>
-        </w:rPr>
-      </w:pPr>
-    </w:p>
-    <w:p>
-      <w:pPr>
-        <w:rPr>
-          <w:lang w:val="en-US"/>
-        </w:rPr>
-      </w:pPr>
-    </w:p>
-    <w:p>
-      <w:pPr>
-        <w:rPr>
-          <w:lang w:val="en-US"/>
-        </w:rPr>
-      </w:pPr>
-      <w:r>
-        <w:rPr>
+          <w:b/>
+          <w:bCs/>
+          <w:lang w:val="en-US"/>
+        </w:rPr>
+      </w:pPr>
+      <w:r>
+        <w:rPr>
+          <w:b/>
+          <w:bCs/>
           <w:lang w:val="en-US"/>
         </w:rPr>
         <w:t>Evidence:</w:t>
@@ -4996,45 +4964,24 @@
     <w:p>
       <w:pPr>
         <w:rPr>
-          <w:lang w:val="en-US"/>
-        </w:rPr>
-      </w:pPr>
-    </w:p>
-    <w:p>
-      <w:pPr>
-        <w:rPr>
-          <w:sz w:val="2"/>
-          <w:szCs w:val="2"/>
-          <w:lang w:val="en-US"/>
-        </w:rPr>
-      </w:pPr>
-    </w:p>
-    <w:p>
-      <w:pPr>
-        <w:rPr>
-          <w:sz w:val="2"/>
-          <w:szCs w:val="2"/>
-          <w:lang w:val="en-US"/>
-        </w:rPr>
-      </w:pPr>
-    </w:p>
-    <w:p>
-      <w:pPr>
-        <w:rPr>
-          <w:sz w:val="2"/>
-          <w:szCs w:val="2"/>
-          <w:lang w:val="en-US"/>
-        </w:rPr>
-      </w:pPr>
-    </w:p>
-    <w:p>
-      <w:r>
-        <w:rPr>
+          <w:b/>
+          <w:bCs/>
+          <w:lang w:val="en-US"/>
+        </w:rPr>
+      </w:pPr>
+      <w:r>
+        <w:rPr>
+          <w:b/>
+          <w:bCs/>
           <w:lang w:val="en-US"/>
         </w:rPr>
         <w:t>Kyle</w:t>
       </w:r>
       <w:r>
+        <w:rPr>
+          <w:b/>
+          <w:bCs/>
+        </w:rPr>
         <w:t xml:space="preserve"> </w:t>
       </w:r>
     </w:p>
@@ -5062,7 +5009,7 @@
                     <pic:cNvPicPr/>
                   </pic:nvPicPr>
                   <pic:blipFill>
-                    <a:blip r:embed="rId36"/>
+                    <a:blip r:embed="rId37"/>
                     <a:stretch>
                       <a:fillRect/>
                     </a:stretch>
@@ -5105,7 +5052,7 @@
                     <pic:cNvPicPr/>
                   </pic:nvPicPr>
                   <pic:blipFill>
-                    <a:blip r:embed="rId37"/>
+                    <a:blip r:embed="rId38"/>
                     <a:stretch>
                       <a:fillRect/>
                     </a:stretch>
@@ -5148,7 +5095,7 @@
                     <pic:cNvPicPr/>
                   </pic:nvPicPr>
                   <pic:blipFill>
-                    <a:blip r:embed="rId38"/>
+                    <a:blip r:embed="rId39"/>
                     <a:stretch>
                       <a:fillRect/>
                     </a:stretch>
@@ -5169,56 +5116,32 @@
         </w:drawing>
       </w:r>
     </w:p>
-    <w:p/>
-    <w:p/>
-    <w:p/>
-    <w:p>
-      <w:r>
+    <w:p>
+      <w:pPr>
+        <w:rPr>
+          <w:b/>
+          <w:bCs/>
+        </w:rPr>
+      </w:pPr>
+      <w:r>
+        <w:rPr>
+          <w:b/>
+          <w:bCs/>
+        </w:rPr>
         <w:lastRenderedPageBreak/>
-        <w:t>Takunda</w:t>
-      </w:r>
-    </w:p>
-    <w:p/>
-    <w:p/>
-    <w:p/>
-    <w:p/>
-    <w:p/>
-    <w:p/>
-    <w:p/>
-    <w:p/>
-    <w:p/>
-    <w:p/>
-    <w:p/>
-    <w:p>
-      <w:r>
-        <w:t>Brett</w:t>
-      </w:r>
-    </w:p>
-    <w:p>
-      <w:pPr>
-        <w:rPr>
-          <w:sz w:val="2"/>
-          <w:szCs w:val="2"/>
-          <w:lang w:val="en-US"/>
-        </w:rPr>
-      </w:pPr>
-      <w:r>
-        <w:rPr>
-          <w:noProof/>
-        </w:rPr>
         <w:drawing>
-          <wp:anchor distT="0" distB="0" distL="114300" distR="114300" simplePos="0" relativeHeight="251714560" behindDoc="0" locked="0" layoutInCell="1" allowOverlap="1" wp14:anchorId="7908AB71" wp14:editId="6253A761">
+          <wp:anchor distT="0" distB="0" distL="114300" distR="114300" simplePos="0" relativeHeight="251723776" behindDoc="0" locked="0" layoutInCell="1" allowOverlap="1" wp14:anchorId="57F1CCB1" wp14:editId="4EF29FAE">
             <wp:simplePos x="0" y="0"/>
-            <wp:positionH relativeFrom="margin">
-              <wp:align>left</wp:align>
+            <wp:positionH relativeFrom="page">
+              <wp:posOffset>4133850</wp:posOffset>
             </wp:positionH>
             <wp:positionV relativeFrom="page">
-              <wp:posOffset>5040713</wp:posOffset>
+              <wp:posOffset>1143000</wp:posOffset>
             </wp:positionV>
-            <wp:extent cx="1531620" cy="2917190"/>
-            <wp:effectExtent l="0" t="0" r="0" b="0"/>
+            <wp:extent cx="3235083" cy="2383790"/>
+            <wp:effectExtent l="0" t="0" r="3810" b="0"/>
             <wp:wrapSquare wrapText="bothSides"/>
-            <wp:docPr id="597196704" name="Picture 6"/>
+            <wp:docPr id="459702488" name="Picture 1"/>
             <wp:cNvGraphicFramePr>
               <a:graphicFrameLocks xmlns:a="http://schemas.openxmlformats.org/drawingml/2006/main" noChangeAspect="1"/>
             </wp:cNvGraphicFramePr>
@@ -5226,33 +5149,23 @@
               <a:graphicData uri="http://schemas.openxmlformats.org/drawingml/2006/picture">
                 <pic:pic xmlns:pic="http://schemas.openxmlformats.org/drawingml/2006/picture">
                   <pic:nvPicPr>
-                    <pic:cNvPr id="0" name="Picture 9"/>
-                    <pic:cNvPicPr>
-                      <a:picLocks noChangeAspect="1" noChangeArrowheads="1"/>
-                    </pic:cNvPicPr>
+                    <pic:cNvPr id="459702488" name=""/>
+                    <pic:cNvPicPr/>
                   </pic:nvPicPr>
                   <pic:blipFill>
-                    <a:blip r:embed="rId39">
-                      <a:extLst>
-                        <a:ext uri="{28A0092B-C50C-407E-A947-70E740481C1C}">
-                          <a14:useLocalDpi xmlns:a14="http://schemas.microsoft.com/office/drawing/2010/main" val="0"/>
-                        </a:ext>
-                      </a:extLst>
-                    </a:blip>
-                    <a:srcRect/>
+                    <a:blip r:embed="rId40"/>
                     <a:stretch>
                       <a:fillRect/>
                     </a:stretch>
                   </pic:blipFill>
-                  <pic:spPr bwMode="auto">
+                  <pic:spPr>
                     <a:xfrm>
                       <a:off x="0" y="0"/>
-                      <a:ext cx="1531620" cy="2917190"/>
+                      <a:ext cx="3235083" cy="2383790"/>
                     </a:xfrm>
                     <a:prstGeom prst="rect">
                       <a:avLst/>
                     </a:prstGeom>
-                    <a:noFill/>
                   </pic:spPr>
                 </pic:pic>
               </a:graphicData>
@@ -5268,12 +5181,101 @@
       </w:r>
       <w:r>
         <w:rPr>
+          <w:b/>
+          <w:bCs/>
+        </w:rPr>
+        <w:drawing>
+          <wp:anchor distT="0" distB="0" distL="114300" distR="114300" simplePos="0" relativeHeight="251722752" behindDoc="0" locked="0" layoutInCell="1" allowOverlap="1" wp14:anchorId="31CD2BF5" wp14:editId="6EADD1CE">
+            <wp:simplePos x="0" y="0"/>
+            <wp:positionH relativeFrom="margin">
+              <wp:posOffset>-190500</wp:posOffset>
+            </wp:positionH>
+            <wp:positionV relativeFrom="page">
+              <wp:posOffset>1143000</wp:posOffset>
+            </wp:positionV>
+            <wp:extent cx="3371850" cy="4981575"/>
+            <wp:effectExtent l="0" t="0" r="0" b="9525"/>
+            <wp:wrapSquare wrapText="bothSides"/>
+            <wp:docPr id="1359936012" name="Picture 1"/>
+            <wp:cNvGraphicFramePr>
+              <a:graphicFrameLocks xmlns:a="http://schemas.openxmlformats.org/drawingml/2006/main" noChangeAspect="1"/>
+            </wp:cNvGraphicFramePr>
+            <a:graphic xmlns:a="http://schemas.openxmlformats.org/drawingml/2006/main">
+              <a:graphicData uri="http://schemas.openxmlformats.org/drawingml/2006/picture">
+                <pic:pic xmlns:pic="http://schemas.openxmlformats.org/drawingml/2006/picture">
+                  <pic:nvPicPr>
+                    <pic:cNvPr id="1359936012" name=""/>
+                    <pic:cNvPicPr/>
+                  </pic:nvPicPr>
+                  <pic:blipFill>
+                    <a:blip r:embed="rId41"/>
+                    <a:stretch>
+                      <a:fillRect/>
+                    </a:stretch>
+                  </pic:blipFill>
+                  <pic:spPr>
+                    <a:xfrm>
+                      <a:off x="0" y="0"/>
+                      <a:ext cx="3371850" cy="4981575"/>
+                    </a:xfrm>
+                    <a:prstGeom prst="rect">
+                      <a:avLst/>
+                    </a:prstGeom>
+                  </pic:spPr>
+                </pic:pic>
+              </a:graphicData>
+            </a:graphic>
+            <wp14:sizeRelH relativeFrom="margin">
+              <wp14:pctWidth>0</wp14:pctWidth>
+            </wp14:sizeRelH>
+            <wp14:sizeRelV relativeFrom="margin">
+              <wp14:pctHeight>0</wp14:pctHeight>
+            </wp14:sizeRelV>
+          </wp:anchor>
+        </w:drawing>
+      </w:r>
+      <w:r>
+        <w:rPr>
+          <w:b/>
+          <w:bCs/>
+          <w:noProof/>
+        </w:rPr>
+        <w:t>Brett</w:t>
+      </w:r>
+    </w:p>
+    <w:p/>
+    <w:p/>
+    <w:p/>
+    <w:p/>
+    <w:p/>
+    <w:p/>
+    <w:p/>
+    <w:p/>
+    <w:p/>
+    <w:p>
+      <w:pPr>
+        <w:rPr>
+          <w:b/>
+          <w:bCs/>
+        </w:rPr>
+      </w:pPr>
+      <w:r>
+        <w:rPr>
+          <w:b/>
+          <w:bCs/>
+        </w:rPr>
+        <w:t>Takunda</w:t>
+      </w:r>
+      <w:r>
+        <w:rPr>
+          <w:b/>
+          <w:bCs/>
           <w:noProof/>
         </w:rPr>
         <mc:AlternateContent>
           <mc:Choice Requires="wps">
             <w:drawing>
-              <wp:anchor distT="0" distB="0" distL="114300" distR="114300" simplePos="0" relativeHeight="251716608" behindDoc="0" locked="0" layoutInCell="1" allowOverlap="1" wp14:anchorId="1DC19214" wp14:editId="240A046B">
+              <wp:anchor distT="0" distB="0" distL="114300" distR="114300" simplePos="0" relativeHeight="251716608" behindDoc="0" locked="0" layoutInCell="1" allowOverlap="1" wp14:anchorId="1DC19214" wp14:editId="0BB0FA9C">
                 <wp:simplePos x="0" y="0"/>
                 <wp:positionH relativeFrom="page">
                   <wp:posOffset>4580965</wp:posOffset>
@@ -5356,118 +5358,15 @@
           </mc:Fallback>
         </mc:AlternateContent>
       </w:r>
-      <w:r>
-        <w:rPr>
-          <w:noProof/>
-        </w:rPr>
-        <mc:AlternateContent>
-          <mc:Choice Requires="wps">
-            <w:drawing>
-              <wp:anchor distT="0" distB="0" distL="114300" distR="114300" simplePos="0" relativeHeight="251715584" behindDoc="0" locked="0" layoutInCell="1" allowOverlap="1" wp14:anchorId="66D89463" wp14:editId="60A5BE93">
-                <wp:simplePos x="0" y="0"/>
-                <wp:positionH relativeFrom="page">
-                  <wp:posOffset>1290918</wp:posOffset>
-                </wp:positionH>
-                <wp:positionV relativeFrom="page">
-                  <wp:posOffset>932329</wp:posOffset>
-                </wp:positionV>
-                <wp:extent cx="796925" cy="385483"/>
-                <wp:effectExtent l="0" t="0" r="0" b="0"/>
-                <wp:wrapNone/>
-                <wp:docPr id="1717445126" name="Text Box 9"/>
-                <wp:cNvGraphicFramePr/>
-                <a:graphic xmlns:a="http://schemas.openxmlformats.org/drawingml/2006/main">
-                  <a:graphicData uri="http://schemas.microsoft.com/office/word/2010/wordprocessingShape">
-                    <wps:wsp>
-                      <wps:cNvSpPr txBox="1"/>
-                      <wps:spPr>
-                        <a:xfrm>
-                          <a:off x="0" y="0"/>
-                          <a:ext cx="796925" cy="385483"/>
-                        </a:xfrm>
-                        <a:prstGeom prst="rect">
-                          <a:avLst/>
-                        </a:prstGeom>
-                        <a:noFill/>
-                        <a:ln w="6350">
-                          <a:noFill/>
-                        </a:ln>
-                      </wps:spPr>
-                      <wps:txbx>
-                        <w:txbxContent>
-                          <w:p>
-                            <w:pPr>
-                              <w:rPr>
-                                <w:lang w:val="en-US"/>
-                              </w:rPr>
-                            </w:pPr>
-                          </w:p>
-                          <w:p>
-                            <w:pPr>
-                              <w:rPr>
-                                <w:lang w:val="en-US"/>
-                              </w:rPr>
-                            </w:pPr>
-                          </w:p>
-                        </w:txbxContent>
-                      </wps:txbx>
-                      <wps:bodyPr rot="0" spcFirstLastPara="0" vertOverflow="clip" horzOverflow="clip" vert="horz" wrap="square" lIns="91440" tIns="45720" rIns="91440" bIns="45720" numCol="1" spcCol="0" rtlCol="0" fromWordArt="0" anchor="t" anchorCtr="0" forceAA="0" compatLnSpc="1">
-                        <a:prstTxWarp prst="textNoShape">
-                          <a:avLst/>
-                        </a:prstTxWarp>
-                        <a:noAutofit/>
-                      </wps:bodyPr>
-                    </wps:wsp>
-                  </a:graphicData>
-                </a:graphic>
-                <wp14:sizeRelH relativeFrom="margin">
-                  <wp14:pctWidth>0</wp14:pctWidth>
-                </wp14:sizeRelH>
-                <wp14:sizeRelV relativeFrom="margin">
-                  <wp14:pctHeight>0</wp14:pctHeight>
-                </wp14:sizeRelV>
-              </wp:anchor>
-            </w:drawing>
-          </mc:Choice>
-          <mc:Fallback>
-            <w:pict>
-              <v:shapetype w14:anchorId="66D89463" id="_x0000_t202" coordsize="21600,21600" o:spt="202" path="m,l,21600r21600,l21600,xe">
-                <v:stroke joinstyle="miter"/>
-                <v:path gradientshapeok="t" o:connecttype="rect"/>
-              </v:shapetype>
-              <v:shape id="Text Box 9" o:spid="_x0000_s1027" type="#_x0000_t202" style="position:absolute;margin-left:101.65pt;margin-top:73.4pt;width:62.75pt;height:30.35pt;z-index:251715584;visibility:visible;mso-wrap-style:square;mso-width-percent:0;mso-height-percent:0;mso-wrap-distance-left:9pt;mso-wrap-distance-top:0;mso-wrap-distance-right:9pt;mso-wrap-distance-bottom:0;mso-position-horizontal:absolute;mso-position-horizontal-relative:page;mso-position-vertical:absolute;mso-position-vertical-relative:page;mso-width-percent:0;mso-height-percent:0;mso-width-relative:margin;mso-height-relative:margin;v-text-anchor:top" o:gfxdata="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" filled="f" stroked="f" strokeweight=".5pt">
-                <v:textbox>
-                  <w:txbxContent>
-                    <w:p>
-                      <w:pPr>
-                        <w:rPr>
-                          <w:lang w:val="en-US"/>
-                        </w:rPr>
-                      </w:pPr>
-                    </w:p>
-                    <w:p>
-                      <w:pPr>
-                        <w:rPr>
-                          <w:lang w:val="en-US"/>
-                        </w:rPr>
-                      </w:pPr>
-                    </w:p>
-                  </w:txbxContent>
-                </v:textbox>
-                <w10:wrap anchorx="page" anchory="page"/>
-              </v:shape>
-            </w:pict>
-          </mc:Fallback>
-        </mc:AlternateContent>
-      </w:r>
-      <w:r>
+    </w:p>
+    <w:p>
+      <w:pPr>
         <w:rPr>
           <w:sz w:val="2"/>
           <w:szCs w:val="2"/>
           <w:lang w:val="en-US"/>
         </w:rPr>
-        <w:tab/>
-      </w:r>
+      </w:pPr>
     </w:p>
     <w:p>
       <w:pPr>
@@ -5486,23 +5385,32 @@
           <w:lang w:val="en-US"/>
         </w:rPr>
       </w:pPr>
+    </w:p>
+    <w:p>
+      <w:pPr>
+        <w:rPr>
+          <w:sz w:val="2"/>
+          <w:szCs w:val="2"/>
+          <w:lang w:val="en-US"/>
+        </w:rPr>
+      </w:pPr>
       <w:r>
         <w:rPr>
           <w:noProof/>
         </w:rPr>
         <w:drawing>
-          <wp:anchor distT="0" distB="0" distL="114300" distR="114300" simplePos="0" relativeHeight="251713536" behindDoc="0" locked="0" layoutInCell="1" allowOverlap="1" wp14:anchorId="260DC343" wp14:editId="751FA3A8">
+          <wp:anchor distT="0" distB="0" distL="114300" distR="114300" simplePos="0" relativeHeight="251714560" behindDoc="0" locked="0" layoutInCell="1" allowOverlap="1" wp14:anchorId="7908AB71" wp14:editId="12CDAC69">
             <wp:simplePos x="0" y="0"/>
             <wp:positionH relativeFrom="margin">
-              <wp:posOffset>-63556</wp:posOffset>
+              <wp:align>left</wp:align>
             </wp:positionH>
             <wp:positionV relativeFrom="page">
-              <wp:posOffset>1589350</wp:posOffset>
+              <wp:posOffset>6802755</wp:posOffset>
             </wp:positionV>
-            <wp:extent cx="1887220" cy="2917190"/>
-            <wp:effectExtent l="0" t="0" r="0" b="0"/>
+            <wp:extent cx="1838325" cy="3500755"/>
+            <wp:effectExtent l="0" t="0" r="9525" b="4445"/>
             <wp:wrapSquare wrapText="bothSides"/>
-            <wp:docPr id="1975775752" name="Picture 7"/>
+            <wp:docPr id="597196704" name="Picture 6"/>
             <wp:cNvGraphicFramePr>
               <a:graphicFrameLocks xmlns:a="http://schemas.openxmlformats.org/drawingml/2006/main" noChangeAspect="1"/>
             </wp:cNvGraphicFramePr>
@@ -5510,13 +5418,13 @@
               <a:graphicData uri="http://schemas.openxmlformats.org/drawingml/2006/picture">
                 <pic:pic xmlns:pic="http://schemas.openxmlformats.org/drawingml/2006/picture">
                   <pic:nvPicPr>
-                    <pic:cNvPr id="0" name="Picture 8"/>
+                    <pic:cNvPr id="0" name="Picture 9"/>
                     <pic:cNvPicPr>
                       <a:picLocks noChangeAspect="1" noChangeArrowheads="1"/>
                     </pic:cNvPicPr>
                   </pic:nvPicPr>
                   <pic:blipFill>
-                    <a:blip r:embed="rId40">
+                    <a:blip r:embed="rId42">
                       <a:extLst>
                         <a:ext uri="{28A0092B-C50C-407E-A947-70E740481C1C}">
                           <a14:useLocalDpi xmlns:a14="http://schemas.microsoft.com/office/drawing/2010/main" val="0"/>
@@ -5531,7 +5439,7 @@
                   <pic:spPr bwMode="auto">
                     <a:xfrm>
                       <a:off x="0" y="0"/>
-                      <a:ext cx="1887220" cy="2917190"/>
+                      <a:ext cx="1838325" cy="3500755"/>
                     </a:xfrm>
                     <a:prstGeom prst="rect">
                       <a:avLst/>
@@ -5698,142 +5606,9 @@
     <w:p>
       <w:pPr>
         <w:rPr>
-          <w:sz w:val="2"/>
-          <w:szCs w:val="2"/>
-          <w:lang w:val="en-US"/>
-        </w:rPr>
-      </w:pPr>
-    </w:p>
-    <w:p>
-      <w:pPr>
-        <w:rPr>
-          <w:sz w:val="2"/>
-          <w:szCs w:val="2"/>
-          <w:lang w:val="en-US"/>
-        </w:rPr>
-      </w:pPr>
-    </w:p>
-    <w:p>
-      <w:pPr>
-        <w:rPr>
-          <w:sz w:val="2"/>
-          <w:szCs w:val="2"/>
-          <w:lang w:val="en-US"/>
-        </w:rPr>
-      </w:pPr>
-    </w:p>
-    <w:p>
-      <w:pPr>
-        <w:rPr>
-          <w:sz w:val="2"/>
-          <w:szCs w:val="2"/>
-          <w:lang w:val="en-US"/>
-        </w:rPr>
-      </w:pPr>
-    </w:p>
-    <w:p>
-      <w:pPr>
-        <w:rPr>
-          <w:sz w:val="2"/>
-          <w:szCs w:val="2"/>
-          <w:lang w:val="en-US"/>
-        </w:rPr>
-      </w:pPr>
-    </w:p>
-    <w:p>
-      <w:pPr>
-        <w:rPr>
-          <w:sz w:val="2"/>
-          <w:szCs w:val="2"/>
-          <w:lang w:val="en-US"/>
-        </w:rPr>
-      </w:pPr>
-    </w:p>
-    <w:p>
-      <w:pPr>
-        <w:rPr>
-          <w:sz w:val="2"/>
-          <w:szCs w:val="2"/>
-          <w:lang w:val="en-US"/>
-        </w:rPr>
-      </w:pPr>
-    </w:p>
-    <w:p>
-      <w:pPr>
-        <w:rPr>
-          <w:sz w:val="2"/>
-          <w:szCs w:val="2"/>
-          <w:lang w:val="en-US"/>
-        </w:rPr>
-      </w:pPr>
-    </w:p>
-    <w:p>
-      <w:pPr>
-        <w:rPr>
-          <w:sz w:val="2"/>
-          <w:szCs w:val="2"/>
-          <w:lang w:val="en-US"/>
-        </w:rPr>
-      </w:pPr>
-    </w:p>
-    <w:p>
-      <w:pPr>
-        <w:rPr>
-          <w:sz w:val="2"/>
-          <w:szCs w:val="2"/>
-          <w:lang w:val="en-US"/>
-        </w:rPr>
-      </w:pPr>
-    </w:p>
-    <w:p>
-      <w:pPr>
-        <w:rPr>
-          <w:lang w:val="en-US"/>
-        </w:rPr>
-      </w:pPr>
-    </w:p>
-    <w:p>
-      <w:pPr>
-        <w:rPr>
-          <w:lang w:val="en-US"/>
-        </w:rPr>
-      </w:pPr>
-    </w:p>
-    <w:p>
-      <w:pPr>
-        <w:rPr>
-          <w:lang w:val="en-US"/>
-        </w:rPr>
-      </w:pPr>
-    </w:p>
-    <w:p>
-      <w:pPr>
-        <w:rPr>
-          <w:lang w:val="en-US"/>
-        </w:rPr>
-      </w:pPr>
-    </w:p>
-    <w:p>
-      <w:pPr>
-        <w:rPr>
-          <w:lang w:val="en-US"/>
-        </w:rPr>
-      </w:pPr>
-      <w:proofErr w:type="spellStart"/>
-      <w:r>
-        <w:rPr>
-          <w:lang w:val="en-US"/>
-        </w:rPr>
-        <w:lastRenderedPageBreak/>
-        <w:t>Doxygen</w:t>
-      </w:r>
-      <w:proofErr w:type="spellEnd"/>
-      <w:r>
-        <w:rPr>
-          <w:lang w:val="en-US"/>
-        </w:rPr>
-        <w:t xml:space="preserve"> Evidence:</w:t>
-      </w:r>
+          <w:lang w:val="en-US"/>
+        </w:rPr>
+      </w:pPr>
     </w:p>
     <w:sectPr>
       <w:type w:val="continuous"/>

</xml_diff>